<commit_message>
UD1_P3_archivos de stack y avances de practica
</commit_message>
<xml_diff>
--- a/UD1/P3/sfRojas_DAW_UD1_P3.docx
+++ b/UD1/P3/sfRojas_DAW_UD1_P3.docx
@@ -2,36 +2,75 @@
 <file path=word/document.xml><?xml version="1.0" encoding="utf-8"?>
 <w:document xmlns:wpc="http://schemas.microsoft.com/office/word/2010/wordprocessingCanvas" xmlns:cx="http://schemas.microsoft.com/office/drawing/2014/chartex" xmlns:mc="http://schemas.openxmlformats.org/markup-compatibility/2006" xmlns:o="urn:schemas-microsoft-com:office:office" xmlns:r="http://schemas.openxmlformats.org/officeDocument/2006/relationships" xmlns:m="http://schemas.openxmlformats.org/officeDocument/2006/math" xmlns:v="urn:schemas-microsoft-com:vml" xmlns:wp14="http://schemas.microsoft.com/office/word/2010/wordprocessingDrawing" xmlns:wp="http://schemas.openxmlformats.org/drawingml/2006/wordprocessingDrawing" xmlns:w10="urn:schemas-microsoft-com:office:word" xmlns:w="http://schemas.openxmlformats.org/wordprocessingml/2006/main" xmlns:w14="http://schemas.microsoft.com/office/word/2010/wordml" xmlns:w15="http://schemas.microsoft.com/office/word/2012/wordml" xmlns:w16se="http://schemas.microsoft.com/office/word/2015/wordml/symex" xmlns:wpg="http://schemas.microsoft.com/office/word/2010/wordprocessingGroup" xmlns:wpi="http://schemas.microsoft.com/office/word/2010/wordprocessingInk" xmlns:wne="http://schemas.microsoft.com/office/word/2006/wordml" xmlns:wps="http://schemas.microsoft.com/office/word/2010/wordprocessingShape" mc:Ignorable="w14 w15 w16se wp14">
   <w:body>
-    <w:p/>
-    <w:p/>
-    <w:p/>
-    <w:p/>
     <w:p>
-      <w:bookmarkStart w:id="0" w:name="_GoBack"/>
-      <w:bookmarkEnd w:id="0"/>
       <w:r>
-        <w:br w:type="page"/>
-      </w:r>
-    </w:p>
-    <w:p/>
-    <w:p/>
-    <w:p/>
-    <w:p/>
-    <w:p/>
-    <w:p>
-      <w:pPr>
-        <w:tabs>
-          <w:tab w:val="left" w:pos="2055"/>
-        </w:tabs>
-      </w:pPr>
-      <w:r>
-        <w:tab/>
+        <w:rPr>
+          <w:noProof/>
+          <w:lang w:eastAsia="es-ES"/>
+        </w:rPr>
+        <w:drawing>
+          <wp:anchor distT="0" distB="0" distL="114300" distR="114300" simplePos="0" relativeHeight="251658240" behindDoc="0" locked="0" layoutInCell="1" allowOverlap="1" wp14:anchorId="28F64491" wp14:editId="0205EB53">
+            <wp:simplePos x="0" y="0"/>
+            <wp:positionH relativeFrom="page">
+              <wp:posOffset>-84147</wp:posOffset>
+            </wp:positionH>
+            <wp:positionV relativeFrom="page">
+              <wp:align>top</wp:align>
+            </wp:positionV>
+            <wp:extent cx="7775205" cy="10694611"/>
+            <wp:effectExtent l="0" t="0" r="0" b="0"/>
+            <wp:wrapSquare wrapText="bothSides"/>
+            <wp:docPr id="1" name="Imagen 1"/>
+            <wp:cNvGraphicFramePr>
+              <a:graphicFrameLocks xmlns:a="http://schemas.openxmlformats.org/drawingml/2006/main" noChangeAspect="1"/>
+            </wp:cNvGraphicFramePr>
+            <a:graphic xmlns:a="http://schemas.openxmlformats.org/drawingml/2006/main">
+              <a:graphicData uri="http://schemas.openxmlformats.org/drawingml/2006/picture">
+                <pic:pic xmlns:pic="http://schemas.openxmlformats.org/drawingml/2006/picture">
+                  <pic:nvPicPr>
+                    <pic:cNvPr id="1" name="Gemini_Generated_Image_sviuvjsviuvjsviu.jpg"/>
+                    <pic:cNvPicPr/>
+                  </pic:nvPicPr>
+                  <pic:blipFill>
+                    <a:blip r:embed="rId8" cstate="print">
+                      <a:extLst>
+                        <a:ext uri="{28A0092B-C50C-407E-A947-70E740481C1C}">
+                          <a14:useLocalDpi xmlns:a14="http://schemas.microsoft.com/office/drawing/2010/main" val="0"/>
+                        </a:ext>
+                      </a:extLst>
+                    </a:blip>
+                    <a:stretch>
+                      <a:fillRect/>
+                    </a:stretch>
+                  </pic:blipFill>
+                  <pic:spPr>
+                    <a:xfrm>
+                      <a:off x="0" y="0"/>
+                      <a:ext cx="7775205" cy="10694611"/>
+                    </a:xfrm>
+                    <a:prstGeom prst="rect">
+                      <a:avLst/>
+                    </a:prstGeom>
+                  </pic:spPr>
+                </pic:pic>
+              </a:graphicData>
+            </a:graphic>
+            <wp14:sizeRelH relativeFrom="margin">
+              <wp14:pctWidth>0</wp14:pctWidth>
+            </wp14:sizeRelH>
+            <wp14:sizeRelV relativeFrom="margin">
+              <wp14:pctHeight>0</wp14:pctHeight>
+            </wp14:sizeRelV>
+          </wp:anchor>
+        </w:drawing>
       </w:r>
     </w:p>
     <w:p>
-      <w:r>
-        <w:br w:type="page"/>
-      </w:r>
+      <w:pPr>
+        <w:tabs>
+          <w:tab w:val="left" w:pos="3240"/>
+        </w:tabs>
+      </w:pPr>
     </w:p>
     <w:sdt>
       <w:sdtPr>
@@ -85,7 +124,7 @@
           <w:r>
             <w:fldChar w:fldCharType="separate"/>
           </w:r>
-          <w:hyperlink w:anchor="_Toc242202465" w:history="1">
+          <w:hyperlink w:anchor="_Toc242453925" w:history="1">
             <w:r>
               <w:rPr>
                 <w:rStyle w:val="Hipervnculo"/>
@@ -106,7 +145,7 @@
                 <w:rStyle w:val="Hipervnculo"/>
                 <w:noProof/>
               </w:rPr>
-              <w:t>TOMCAT:</w:t>
+              <w:t>INTRODUCCIÓN:</w:t>
             </w:r>
             <w:r>
               <w:rPr>
@@ -127,7 +166,7 @@
                 <w:noProof/>
                 <w:webHidden/>
               </w:rPr>
-              <w:instrText xml:space="preserve"> PAGEREF _Toc242202465 \h </w:instrText>
+              <w:instrText xml:space="preserve"> PAGEREF _Toc242453925 \h </w:instrText>
             </w:r>
             <w:r>
               <w:rPr>
@@ -171,7 +210,7 @@
               <w:lang w:eastAsia="es-ES"/>
             </w:rPr>
           </w:pPr>
-          <w:hyperlink w:anchor="_Toc242202466" w:history="1">
+          <w:hyperlink w:anchor="_Toc242453926" w:history="1">
             <w:r>
               <w:rPr>
                 <w:rStyle w:val="Hipervnculo"/>
@@ -192,7 +231,7 @@
                 <w:rStyle w:val="Hipervnculo"/>
                 <w:noProof/>
               </w:rPr>
-              <w:t>ECLIPSE:</w:t>
+              <w:t>DESARROLLO:</w:t>
             </w:r>
             <w:r>
               <w:rPr>
@@ -213,7 +252,7 @@
                 <w:noProof/>
                 <w:webHidden/>
               </w:rPr>
-              <w:instrText xml:space="preserve"> PAGEREF _Toc242202466 \h </w:instrText>
+              <w:instrText xml:space="preserve"> PAGEREF _Toc242453926 \h </w:instrText>
             </w:r>
             <w:r>
               <w:rPr>
@@ -233,7 +272,357 @@
                 <w:noProof/>
                 <w:webHidden/>
               </w:rPr>
-              <w:t>3</w:t>
+              <w:t>4</w:t>
+            </w:r>
+            <w:r>
+              <w:rPr>
+                <w:noProof/>
+                <w:webHidden/>
+              </w:rPr>
+              <w:fldChar w:fldCharType="end"/>
+            </w:r>
+          </w:hyperlink>
+        </w:p>
+        <w:p>
+          <w:pPr>
+            <w:pStyle w:val="TDC2"/>
+            <w:tabs>
+              <w:tab w:val="right" w:leader="dot" w:pos="8494"/>
+            </w:tabs>
+            <w:rPr>
+              <w:rFonts w:eastAsiaTheme="minorEastAsia"/>
+              <w:noProof/>
+              <w:lang w:eastAsia="es-ES"/>
+            </w:rPr>
+          </w:pPr>
+          <w:hyperlink w:anchor="_Toc242453927" w:history="1">
+            <w:r>
+              <w:rPr>
+                <w:rStyle w:val="Hipervnculo"/>
+                <w:noProof/>
+              </w:rPr>
+              <w:t>CAPTURAS:</w:t>
+            </w:r>
+            <w:r>
+              <w:rPr>
+                <w:noProof/>
+                <w:webHidden/>
+              </w:rPr>
+              <w:tab/>
+            </w:r>
+            <w:r>
+              <w:rPr>
+                <w:noProof/>
+                <w:webHidden/>
+              </w:rPr>
+              <w:fldChar w:fldCharType="begin"/>
+            </w:r>
+            <w:r>
+              <w:rPr>
+                <w:noProof/>
+                <w:webHidden/>
+              </w:rPr>
+              <w:instrText xml:space="preserve"> PAGEREF _Toc242453927 \h </w:instrText>
+            </w:r>
+            <w:r>
+              <w:rPr>
+                <w:noProof/>
+                <w:webHidden/>
+              </w:rPr>
+            </w:r>
+            <w:r>
+              <w:rPr>
+                <w:noProof/>
+                <w:webHidden/>
+              </w:rPr>
+              <w:fldChar w:fldCharType="separate"/>
+            </w:r>
+            <w:r>
+              <w:rPr>
+                <w:noProof/>
+                <w:webHidden/>
+              </w:rPr>
+              <w:t>4</w:t>
+            </w:r>
+            <w:r>
+              <w:rPr>
+                <w:noProof/>
+                <w:webHidden/>
+              </w:rPr>
+              <w:fldChar w:fldCharType="end"/>
+            </w:r>
+          </w:hyperlink>
+        </w:p>
+        <w:p>
+          <w:pPr>
+            <w:pStyle w:val="TDC2"/>
+            <w:tabs>
+              <w:tab w:val="right" w:leader="dot" w:pos="8494"/>
+            </w:tabs>
+            <w:rPr>
+              <w:rFonts w:eastAsiaTheme="minorEastAsia"/>
+              <w:noProof/>
+              <w:lang w:eastAsia="es-ES"/>
+            </w:rPr>
+          </w:pPr>
+          <w:hyperlink w:anchor="_Toc242453928" w:history="1">
+            <w:r>
+              <w:rPr>
+                <w:rStyle w:val="Hipervnculo"/>
+                <w:noProof/>
+              </w:rPr>
+              <w:t>EXPLICACIONES:</w:t>
+            </w:r>
+            <w:r>
+              <w:rPr>
+                <w:noProof/>
+                <w:webHidden/>
+              </w:rPr>
+              <w:tab/>
+            </w:r>
+            <w:r>
+              <w:rPr>
+                <w:noProof/>
+                <w:webHidden/>
+              </w:rPr>
+              <w:fldChar w:fldCharType="begin"/>
+            </w:r>
+            <w:r>
+              <w:rPr>
+                <w:noProof/>
+                <w:webHidden/>
+              </w:rPr>
+              <w:instrText xml:space="preserve"> PAGEREF _Toc242453928 \h </w:instrText>
+            </w:r>
+            <w:r>
+              <w:rPr>
+                <w:noProof/>
+                <w:webHidden/>
+              </w:rPr>
+            </w:r>
+            <w:r>
+              <w:rPr>
+                <w:noProof/>
+                <w:webHidden/>
+              </w:rPr>
+              <w:fldChar w:fldCharType="separate"/>
+            </w:r>
+            <w:r>
+              <w:rPr>
+                <w:noProof/>
+                <w:webHidden/>
+              </w:rPr>
+              <w:t>4</w:t>
+            </w:r>
+            <w:r>
+              <w:rPr>
+                <w:noProof/>
+                <w:webHidden/>
+              </w:rPr>
+              <w:fldChar w:fldCharType="end"/>
+            </w:r>
+          </w:hyperlink>
+        </w:p>
+        <w:p>
+          <w:pPr>
+            <w:pStyle w:val="TDC2"/>
+            <w:tabs>
+              <w:tab w:val="right" w:leader="dot" w:pos="8494"/>
+            </w:tabs>
+            <w:rPr>
+              <w:rFonts w:eastAsiaTheme="minorEastAsia"/>
+              <w:noProof/>
+              <w:lang w:eastAsia="es-ES"/>
+            </w:rPr>
+          </w:pPr>
+          <w:hyperlink w:anchor="_Toc242453929" w:history="1">
+            <w:r>
+              <w:rPr>
+                <w:rStyle w:val="Hipervnculo"/>
+                <w:noProof/>
+              </w:rPr>
+              <w:t>PÁGINA WEB:</w:t>
+            </w:r>
+            <w:r>
+              <w:rPr>
+                <w:noProof/>
+                <w:webHidden/>
+              </w:rPr>
+              <w:tab/>
+            </w:r>
+            <w:r>
+              <w:rPr>
+                <w:noProof/>
+                <w:webHidden/>
+              </w:rPr>
+              <w:fldChar w:fldCharType="begin"/>
+            </w:r>
+            <w:r>
+              <w:rPr>
+                <w:noProof/>
+                <w:webHidden/>
+              </w:rPr>
+              <w:instrText xml:space="preserve"> PAGEREF _Toc242453929 \h </w:instrText>
+            </w:r>
+            <w:r>
+              <w:rPr>
+                <w:noProof/>
+                <w:webHidden/>
+              </w:rPr>
+            </w:r>
+            <w:r>
+              <w:rPr>
+                <w:noProof/>
+                <w:webHidden/>
+              </w:rPr>
+              <w:fldChar w:fldCharType="separate"/>
+            </w:r>
+            <w:r>
+              <w:rPr>
+                <w:noProof/>
+                <w:webHidden/>
+              </w:rPr>
+              <w:t>4</w:t>
+            </w:r>
+            <w:r>
+              <w:rPr>
+                <w:noProof/>
+                <w:webHidden/>
+              </w:rPr>
+              <w:fldChar w:fldCharType="end"/>
+            </w:r>
+          </w:hyperlink>
+        </w:p>
+        <w:p>
+          <w:pPr>
+            <w:pStyle w:val="TDC2"/>
+            <w:tabs>
+              <w:tab w:val="right" w:leader="dot" w:pos="8494"/>
+            </w:tabs>
+            <w:rPr>
+              <w:rFonts w:eastAsiaTheme="minorEastAsia"/>
+              <w:noProof/>
+              <w:lang w:eastAsia="es-ES"/>
+            </w:rPr>
+          </w:pPr>
+          <w:hyperlink w:anchor="_Toc242453930" w:history="1">
+            <w:r>
+              <w:rPr>
+                <w:rStyle w:val="Hipervnculo"/>
+                <w:noProof/>
+              </w:rPr>
+              <w:t>APLICACIÓN WEB:</w:t>
+            </w:r>
+            <w:r>
+              <w:rPr>
+                <w:noProof/>
+                <w:webHidden/>
+              </w:rPr>
+              <w:tab/>
+            </w:r>
+            <w:r>
+              <w:rPr>
+                <w:noProof/>
+                <w:webHidden/>
+              </w:rPr>
+              <w:fldChar w:fldCharType="begin"/>
+            </w:r>
+            <w:r>
+              <w:rPr>
+                <w:noProof/>
+                <w:webHidden/>
+              </w:rPr>
+              <w:instrText xml:space="preserve"> PAGEREF _Toc242453930 \h </w:instrText>
+            </w:r>
+            <w:r>
+              <w:rPr>
+                <w:noProof/>
+                <w:webHidden/>
+              </w:rPr>
+            </w:r>
+            <w:r>
+              <w:rPr>
+                <w:noProof/>
+                <w:webHidden/>
+              </w:rPr>
+              <w:fldChar w:fldCharType="separate"/>
+            </w:r>
+            <w:r>
+              <w:rPr>
+                <w:noProof/>
+                <w:webHidden/>
+              </w:rPr>
+              <w:t>4</w:t>
+            </w:r>
+            <w:r>
+              <w:rPr>
+                <w:noProof/>
+                <w:webHidden/>
+              </w:rPr>
+              <w:fldChar w:fldCharType="end"/>
+            </w:r>
+          </w:hyperlink>
+        </w:p>
+        <w:p>
+          <w:pPr>
+            <w:pStyle w:val="TDC2"/>
+            <w:tabs>
+              <w:tab w:val="right" w:leader="dot" w:pos="8494"/>
+            </w:tabs>
+            <w:rPr>
+              <w:rFonts w:eastAsiaTheme="minorEastAsia"/>
+              <w:noProof/>
+              <w:lang w:eastAsia="es-ES"/>
+            </w:rPr>
+          </w:pPr>
+          <w:hyperlink w:anchor="_Toc242453931" w:history="1">
+            <w:r>
+              <w:rPr>
+                <w:rStyle w:val="Hipervnculo"/>
+                <w:noProof/>
+              </w:rPr>
+              <w:t>LA FORMA DE CONEXIÓN DE AMBAS</w:t>
+            </w:r>
+            <w:r>
+              <w:rPr>
+                <w:noProof/>
+                <w:webHidden/>
+              </w:rPr>
+              <w:tab/>
+            </w:r>
+            <w:r>
+              <w:rPr>
+                <w:noProof/>
+                <w:webHidden/>
+              </w:rPr>
+              <w:fldChar w:fldCharType="begin"/>
+            </w:r>
+            <w:r>
+              <w:rPr>
+                <w:noProof/>
+                <w:webHidden/>
+              </w:rPr>
+              <w:instrText xml:space="preserve"> PAGEREF _Toc242453931 \h </w:instrText>
+            </w:r>
+            <w:r>
+              <w:rPr>
+                <w:noProof/>
+                <w:webHidden/>
+              </w:rPr>
+            </w:r>
+            <w:r>
+              <w:rPr>
+                <w:noProof/>
+                <w:webHidden/>
+              </w:rPr>
+              <w:fldChar w:fldCharType="separate"/>
+            </w:r>
+            <w:r>
+              <w:rPr>
+                <w:noProof/>
+                <w:webHidden/>
+              </w:rPr>
+              <w:t>4</w:t>
             </w:r>
             <w:r>
               <w:rPr>
@@ -257,7 +646,7 @@
               <w:lang w:eastAsia="es-ES"/>
             </w:rPr>
           </w:pPr>
-          <w:hyperlink w:anchor="_Toc242202467" w:history="1">
+          <w:hyperlink w:anchor="_Toc242453932" w:history="1">
             <w:r>
               <w:rPr>
                 <w:rStyle w:val="Hipervnculo"/>
@@ -278,7 +667,7 @@
                 <w:rStyle w:val="Hipervnculo"/>
                 <w:noProof/>
               </w:rPr>
-              <w:t>DEFINIR UN NUEVO SERVIDOR</w:t>
+              <w:t>INVESTIGACIÓN:</w:t>
             </w:r>
             <w:r>
               <w:rPr>
@@ -299,7 +688,7 @@
                 <w:noProof/>
                 <w:webHidden/>
               </w:rPr>
-              <w:instrText xml:space="preserve"> PAGEREF _Toc242202467 \h </w:instrText>
+              <w:instrText xml:space="preserve"> PAGEREF _Toc242453932 \h </w:instrText>
             </w:r>
             <w:r>
               <w:rPr>
@@ -319,7 +708,7 @@
                 <w:noProof/>
                 <w:webHidden/>
               </w:rPr>
-              <w:t>3</w:t>
+              <w:t>4</w:t>
             </w:r>
             <w:r>
               <w:rPr>
@@ -332,9 +721,8 @@
         </w:p>
         <w:p>
           <w:pPr>
-            <w:pStyle w:val="TDC1"/>
+            <w:pStyle w:val="TDC2"/>
             <w:tabs>
-              <w:tab w:val="left" w:pos="440"/>
               <w:tab w:val="right" w:leader="dot" w:pos="8494"/>
             </w:tabs>
             <w:rPr>
@@ -343,38 +731,23 @@
               <w:lang w:eastAsia="es-ES"/>
             </w:rPr>
           </w:pPr>
-          <w:hyperlink w:anchor="_Toc242202468" w:history="1">
+          <w:hyperlink w:anchor="_Toc242453933" w:history="1">
             <w:r>
               <w:rPr>
                 <w:rStyle w:val="Hipervnculo"/>
                 <w:noProof/>
               </w:rPr>
-              <w:t>4.</w:t>
-            </w:r>
-            <w:r>
-              <w:rPr>
-                <w:rFonts w:eastAsiaTheme="minorEastAsia"/>
-                <w:noProof/>
-                <w:lang w:eastAsia="es-ES"/>
+              <w:t>LO MÁS COMPLEJO DE LA ACTIVIDAD:</w:t>
+            </w:r>
+            <w:r>
+              <w:rPr>
+                <w:noProof/>
+                <w:webHidden/>
               </w:rPr>
               <w:tab/>
             </w:r>
             <w:r>
               <w:rPr>
-                <w:rStyle w:val="Hipervnculo"/>
-                <w:noProof/>
-              </w:rPr>
-              <w:t>NUEVO PROYECTO:</w:t>
-            </w:r>
-            <w:r>
-              <w:rPr>
-                <w:noProof/>
-                <w:webHidden/>
-              </w:rPr>
-              <w:tab/>
-            </w:r>
-            <w:r>
-              <w:rPr>
                 <w:noProof/>
                 <w:webHidden/>
               </w:rPr>
@@ -385,7 +758,7 @@
                 <w:noProof/>
                 <w:webHidden/>
               </w:rPr>
-              <w:instrText xml:space="preserve"> PAGEREF _Toc242202468 \h </w:instrText>
+              <w:instrText xml:space="preserve"> PAGEREF _Toc242453933 \h </w:instrText>
             </w:r>
             <w:r>
               <w:rPr>
@@ -405,7 +778,7 @@
                 <w:noProof/>
                 <w:webHidden/>
               </w:rPr>
-              <w:t>3</w:t>
+              <w:t>4</w:t>
             </w:r>
             <w:r>
               <w:rPr>
@@ -418,9 +791,76 @@
         </w:p>
         <w:p>
           <w:pPr>
-            <w:pStyle w:val="TDC1"/>
+            <w:pStyle w:val="TDC3"/>
             <w:tabs>
-              <w:tab w:val="left" w:pos="440"/>
+              <w:tab w:val="right" w:leader="dot" w:pos="8494"/>
+            </w:tabs>
+            <w:rPr>
+              <w:noProof/>
+            </w:rPr>
+          </w:pPr>
+          <w:hyperlink w:anchor="_Toc242453934" w:history="1">
+            <w:r>
+              <w:rPr>
+                <w:rStyle w:val="Hipervnculo"/>
+                <w:noProof/>
+              </w:rPr>
+              <w:t>¿Cómo lo resolví?</w:t>
+            </w:r>
+            <w:r>
+              <w:rPr>
+                <w:noProof/>
+                <w:webHidden/>
+              </w:rPr>
+              <w:tab/>
+            </w:r>
+            <w:r>
+              <w:rPr>
+                <w:noProof/>
+                <w:webHidden/>
+              </w:rPr>
+              <w:fldChar w:fldCharType="begin"/>
+            </w:r>
+            <w:r>
+              <w:rPr>
+                <w:noProof/>
+                <w:webHidden/>
+              </w:rPr>
+              <w:instrText xml:space="preserve"> PAGEREF _Toc242453934 \h </w:instrText>
+            </w:r>
+            <w:r>
+              <w:rPr>
+                <w:noProof/>
+                <w:webHidden/>
+              </w:rPr>
+            </w:r>
+            <w:r>
+              <w:rPr>
+                <w:noProof/>
+                <w:webHidden/>
+              </w:rPr>
+              <w:fldChar w:fldCharType="separate"/>
+            </w:r>
+            <w:r>
+              <w:rPr>
+                <w:noProof/>
+                <w:webHidden/>
+              </w:rPr>
+              <w:t>4</w:t>
+            </w:r>
+            <w:r>
+              <w:rPr>
+                <w:noProof/>
+                <w:webHidden/>
+              </w:rPr>
+              <w:fldChar w:fldCharType="end"/>
+            </w:r>
+          </w:hyperlink>
+        </w:p>
+        <w:p>
+          <w:pPr>
+            <w:pStyle w:val="TDC2"/>
+            <w:tabs>
               <w:tab w:val="right" w:leader="dot" w:pos="8494"/>
             </w:tabs>
             <w:rPr>
@@ -429,28 +869,81 @@
               <w:lang w:eastAsia="es-ES"/>
             </w:rPr>
           </w:pPr>
-          <w:hyperlink w:anchor="_Toc242202469" w:history="1">
+          <w:hyperlink w:anchor="_Toc242453935" w:history="1">
             <w:r>
               <w:rPr>
                 <w:rStyle w:val="Hipervnculo"/>
                 <w:noProof/>
               </w:rPr>
-              <w:t>1.</w:t>
-            </w:r>
-            <w:r>
-              <w:rPr>
-                <w:rFonts w:eastAsiaTheme="minorEastAsia"/>
-                <w:noProof/>
-                <w:lang w:eastAsia="es-ES"/>
+              <w:t>OTRO SERVIDOR WEB:</w:t>
+            </w:r>
+            <w:r>
+              <w:rPr>
+                <w:noProof/>
+                <w:webHidden/>
               </w:rPr>
               <w:tab/>
             </w:r>
             <w:r>
               <w:rPr>
+                <w:noProof/>
+                <w:webHidden/>
+              </w:rPr>
+              <w:fldChar w:fldCharType="begin"/>
+            </w:r>
+            <w:r>
+              <w:rPr>
+                <w:noProof/>
+                <w:webHidden/>
+              </w:rPr>
+              <w:instrText xml:space="preserve"> PAGEREF _Toc242453935 \h </w:instrText>
+            </w:r>
+            <w:r>
+              <w:rPr>
+                <w:noProof/>
+                <w:webHidden/>
+              </w:rPr>
+            </w:r>
+            <w:r>
+              <w:rPr>
+                <w:noProof/>
+                <w:webHidden/>
+              </w:rPr>
+              <w:fldChar w:fldCharType="separate"/>
+            </w:r>
+            <w:r>
+              <w:rPr>
+                <w:noProof/>
+                <w:webHidden/>
+              </w:rPr>
+              <w:t>4</w:t>
+            </w:r>
+            <w:r>
+              <w:rPr>
+                <w:noProof/>
+                <w:webHidden/>
+              </w:rPr>
+              <w:fldChar w:fldCharType="end"/>
+            </w:r>
+          </w:hyperlink>
+        </w:p>
+        <w:p>
+          <w:pPr>
+            <w:pStyle w:val="TDC3"/>
+            <w:tabs>
+              <w:tab w:val="right" w:leader="dot" w:pos="8494"/>
+            </w:tabs>
+            <w:rPr>
+              <w:noProof/>
+            </w:rPr>
+          </w:pPr>
+          <w:hyperlink w:anchor="_Toc242453936" w:history="1">
+            <w:r>
+              <w:rPr>
                 <w:rStyle w:val="Hipervnculo"/>
                 <w:noProof/>
               </w:rPr>
-              <w:t>PROYECTO PROPIO DE PRUEBA:</w:t>
+              <w:t>Comparado con Apache</w:t>
             </w:r>
             <w:r>
               <w:rPr>
@@ -471,7 +964,7 @@
                 <w:noProof/>
                 <w:webHidden/>
               </w:rPr>
-              <w:instrText xml:space="preserve"> PAGEREF _Toc242202469 \h </w:instrText>
+              <w:instrText xml:space="preserve"> PAGEREF _Toc242453936 \h </w:instrText>
             </w:r>
             <w:r>
               <w:rPr>
@@ -491,7 +984,7 @@
                 <w:noProof/>
                 <w:webHidden/>
               </w:rPr>
-              <w:t>3</w:t>
+              <w:t>4</w:t>
             </w:r>
             <w:r>
               <w:rPr>
@@ -513,23 +1006,216 @@
         </w:p>
       </w:sdtContent>
     </w:sdt>
+    <w:p/>
+    <w:p/>
+    <w:p/>
+    <w:p/>
+    <w:p/>
+    <w:p/>
+    <w:p/>
+    <w:p/>
+    <w:p/>
+    <w:p/>
+    <w:p/>
+    <w:p/>
+    <w:p/>
+    <w:p/>
+    <w:p/>
+    <w:p/>
+    <w:p/>
+    <w:p/>
+    <w:p/>
+    <w:p/>
+    <w:p/>
+    <w:p/>
+    <w:p/>
+    <w:p/>
+    <w:p/>
     <w:p>
+      <w:pPr>
+        <w:pStyle w:val="Ttulo1"/>
+        <w:numPr>
+          <w:ilvl w:val="0"/>
+          <w:numId w:val="11"/>
+        </w:numPr>
+      </w:pPr>
+      <w:bookmarkStart w:id="0" w:name="_Toc242453925"/>
       <w:r>
-        <w:br w:type="page"/>
+        <w:t>INTRODUCCIÓN:</w:t>
+      </w:r>
+      <w:bookmarkEnd w:id="0"/>
+    </w:p>
+    <w:p/>
+    <w:p/>
+    <w:p>
+      <w:pPr>
+        <w:jc w:val="both"/>
+        <w:rPr>
+          <w:rFonts w:asciiTheme="majorHAnsi" w:hAnsiTheme="majorHAnsi" w:cstheme="majorHAnsi"/>
+          <w:sz w:val="24"/>
+          <w:szCs w:val="24"/>
+        </w:rPr>
+      </w:pPr>
+      <w:r>
+        <w:rPr>
+          <w:rFonts w:asciiTheme="majorHAnsi" w:hAnsiTheme="majorHAnsi" w:cstheme="majorHAnsi"/>
+          <w:sz w:val="24"/>
+          <w:szCs w:val="24"/>
+        </w:rPr>
+        <w:t>Para esta práctica, la opción más rápida y cómoda hubiera sido reciclar la aplicación de la Bola Mágica que hicimos en Tomcat la semana anterior, enlazarla a una web sencilla y quedarme tranquila con el 6. También venía arrastrando la temática de NÉBULA y los autos voladores de las prácticas anteriores, pero la verdad es que ya me apetecía cambiar de aire por completo y crear algo desde cero con lo que de verdad conectara.   Así nació STACK (The Artisan Melt).</w:t>
       </w:r>
     </w:p>
     <w:p>
       <w:pPr>
+        <w:jc w:val="both"/>
+        <w:rPr>
+          <w:rFonts w:asciiTheme="majorHAnsi" w:hAnsiTheme="majorHAnsi" w:cstheme="majorHAnsi"/>
+          <w:sz w:val="24"/>
+          <w:szCs w:val="24"/>
+        </w:rPr>
+      </w:pPr>
+      <w:r>
+        <w:rPr>
+          <w:rFonts w:asciiTheme="majorHAnsi" w:hAnsiTheme="majorHAnsi" w:cstheme="majorHAnsi"/>
+          <w:sz w:val="24"/>
+          <w:szCs w:val="24"/>
+        </w:rPr>
+        <w:t xml:space="preserve"> La idea </w:t>
+      </w:r>
+      <w:r>
+        <w:rPr>
+          <w:rFonts w:asciiTheme="majorHAnsi" w:hAnsiTheme="majorHAnsi" w:cstheme="majorHAnsi"/>
+          <w:sz w:val="24"/>
+          <w:szCs w:val="24"/>
+        </w:rPr>
+        <w:t>es</w:t>
+      </w:r>
+      <w:r>
+        <w:rPr>
+          <w:rFonts w:asciiTheme="majorHAnsi" w:hAnsiTheme="majorHAnsi" w:cstheme="majorHAnsi"/>
+          <w:sz w:val="24"/>
+          <w:szCs w:val="24"/>
+        </w:rPr>
+        <w:t xml:space="preserve"> un doble sentido: por un lado, la pila tecnológica que estamos usando para el despliegue (la web en Apache y la aplicación interactiva); y por el otro, la pila real de ingredientes con la que se arma un buen sándwich artesanal.   En lugar de hacer otro formulario aburrido o una calculadora típica, quise montar un sistema de comandas interactivo donde el usuario pueda elegir sus ingredientes paso a paso y sacar su ticket. </w:t>
+      </w:r>
+    </w:p>
+    <w:p>
+      <w:pPr>
+        <w:jc w:val="both"/>
+        <w:rPr>
+          <w:rFonts w:asciiTheme="majorHAnsi" w:hAnsiTheme="majorHAnsi" w:cstheme="majorHAnsi"/>
+          <w:sz w:val="24"/>
+          <w:szCs w:val="24"/>
+        </w:rPr>
+      </w:pPr>
+      <w:r>
+        <w:rPr>
+          <w:rFonts w:asciiTheme="majorHAnsi" w:hAnsiTheme="majorHAnsi" w:cstheme="majorHAnsi"/>
+          <w:sz w:val="24"/>
+          <w:szCs w:val="24"/>
+        </w:rPr>
+        <w:t>La intención de este proyecto es que, entre tantas correcciones y tanto trabajo técnico, usted también pueda tomarse un respiro, probar la aplicación, armarse su sándwich ideal a su gusto y ver cómo responde el servidor en tiempo real.   A lo largo de este informe explico cómo he dejado montada la web estática en Apache, el funcionamiento de la aplicación y la forma en que ambos</w:t>
+      </w:r>
+      <w:r>
+        <w:rPr>
+          <w:rFonts w:asciiTheme="majorHAnsi" w:hAnsiTheme="majorHAnsi" w:cstheme="majorHAnsi"/>
+          <w:sz w:val="24"/>
+          <w:szCs w:val="24"/>
+        </w:rPr>
+        <w:t xml:space="preserve"> entornos quedan comunicados.  Y más allá de buscar una empresa real, que le he estado dando unas vueltas y creo que funcionaría, pues nada por ahora no es más que algo bonito para disfrutar el trabajo. </w:t>
+      </w:r>
+    </w:p>
+    <w:p>
+      <w:pPr>
+        <w:jc w:val="both"/>
+        <w:rPr>
+          <w:rFonts w:asciiTheme="majorHAnsi" w:hAnsiTheme="majorHAnsi" w:cstheme="majorHAnsi"/>
+          <w:sz w:val="24"/>
+          <w:szCs w:val="24"/>
+        </w:rPr>
+      </w:pPr>
+    </w:p>
+    <w:p>
+      <w:pPr>
+        <w:jc w:val="both"/>
+        <w:rPr>
+          <w:rFonts w:asciiTheme="majorHAnsi" w:hAnsiTheme="majorHAnsi" w:cstheme="majorHAnsi"/>
+          <w:sz w:val="24"/>
+          <w:szCs w:val="24"/>
+        </w:rPr>
+      </w:pPr>
+    </w:p>
+    <w:p>
+      <w:pPr>
+        <w:jc w:val="both"/>
+        <w:rPr>
+          <w:rFonts w:asciiTheme="majorHAnsi" w:hAnsiTheme="majorHAnsi" w:cstheme="majorHAnsi"/>
+          <w:sz w:val="24"/>
+          <w:szCs w:val="24"/>
+        </w:rPr>
+      </w:pPr>
+    </w:p>
+    <w:p>
+      <w:pPr>
+        <w:jc w:val="both"/>
+        <w:rPr>
+          <w:rFonts w:asciiTheme="majorHAnsi" w:hAnsiTheme="majorHAnsi" w:cstheme="majorHAnsi"/>
+          <w:sz w:val="24"/>
+          <w:szCs w:val="24"/>
+        </w:rPr>
+      </w:pPr>
+    </w:p>
+    <w:p>
+      <w:pPr>
+        <w:jc w:val="both"/>
+        <w:rPr>
+          <w:rFonts w:asciiTheme="majorHAnsi" w:hAnsiTheme="majorHAnsi" w:cstheme="majorHAnsi"/>
+          <w:sz w:val="24"/>
+          <w:szCs w:val="24"/>
+        </w:rPr>
+      </w:pPr>
+    </w:p>
+    <w:p>
+      <w:pPr>
+        <w:jc w:val="both"/>
+        <w:rPr>
+          <w:rFonts w:asciiTheme="majorHAnsi" w:hAnsiTheme="majorHAnsi" w:cstheme="majorHAnsi"/>
+          <w:sz w:val="24"/>
+          <w:szCs w:val="24"/>
+        </w:rPr>
+      </w:pPr>
+    </w:p>
+    <w:p>
+      <w:pPr>
+        <w:jc w:val="both"/>
+        <w:rPr>
+          <w:rFonts w:asciiTheme="majorHAnsi" w:hAnsiTheme="majorHAnsi" w:cstheme="majorHAnsi"/>
+          <w:sz w:val="24"/>
+          <w:szCs w:val="24"/>
+        </w:rPr>
+      </w:pPr>
+    </w:p>
+    <w:p>
+      <w:pPr>
+        <w:jc w:val="both"/>
+        <w:rPr>
+          <w:rFonts w:asciiTheme="majorHAnsi" w:hAnsiTheme="majorHAnsi" w:cstheme="majorHAnsi"/>
+          <w:sz w:val="24"/>
+          <w:szCs w:val="24"/>
+        </w:rPr>
+      </w:pPr>
+    </w:p>
+    <w:p>
+      <w:pPr>
         <w:pStyle w:val="Ttulo1"/>
         <w:numPr>
           <w:ilvl w:val="0"/>
-          <w:numId w:val="1"/>
+          <w:numId w:val="11"/>
         </w:numPr>
       </w:pPr>
-      <w:bookmarkStart w:id="1" w:name="_Toc242202465"/>
+      <w:bookmarkStart w:id="1" w:name="_Toc242453926"/>
       <w:r>
-        <w:lastRenderedPageBreak/>
-        <w:t>TOMCAT</w:t>
+        <w:t>DESARROLLO</w:t>
       </w:r>
       <w:r>
         <w:t>:</w:t>
@@ -539,53 +1225,54 @@
     <w:p/>
     <w:p>
       <w:pPr>
-        <w:pStyle w:val="Ttulo1"/>
-        <w:numPr>
-          <w:ilvl w:val="0"/>
-          <w:numId w:val="1"/>
-        </w:numPr>
-      </w:pPr>
-      <w:bookmarkStart w:id="2" w:name="_Toc242202466"/>
+        <w:pStyle w:val="Ttulo2"/>
+      </w:pPr>
+      <w:bookmarkStart w:id="2" w:name="_Toc242453927"/>
       <w:r>
-        <w:t>ECLIPSE</w:t>
-      </w:r>
-      <w:r>
-        <w:t>:</w:t>
+        <w:t>CAPTURAS:</w:t>
       </w:r>
       <w:bookmarkEnd w:id="2"/>
     </w:p>
-    <w:p/>
     <w:p>
       <w:pPr>
-        <w:pStyle w:val="Ttulo1"/>
-        <w:numPr>
-          <w:ilvl w:val="0"/>
-          <w:numId w:val="1"/>
-        </w:numPr>
-      </w:pPr>
-      <w:bookmarkStart w:id="3" w:name="_Toc242202467"/>
+        <w:pStyle w:val="Ttulo2"/>
+      </w:pPr>
+      <w:bookmarkStart w:id="3" w:name="_Toc242453928"/>
       <w:r>
-        <w:t>DEFINIR UN NUEVO SERVIDOR</w:t>
+        <w:t>EXPLICACIONES:</w:t>
       </w:r>
       <w:bookmarkEnd w:id="3"/>
     </w:p>
-    <w:p/>
-    <w:p/>
     <w:p>
       <w:pPr>
-        <w:pStyle w:val="Ttulo1"/>
-        <w:numPr>
-          <w:ilvl w:val="0"/>
-          <w:numId w:val="1"/>
-        </w:numPr>
-      </w:pPr>
-      <w:bookmarkStart w:id="4" w:name="_Toc242202468"/>
+        <w:pStyle w:val="Ttulo2"/>
+      </w:pPr>
+      <w:bookmarkStart w:id="4" w:name="_Toc242453929"/>
       <w:r>
-        <w:t>NUEVO PROYECTO:</w:t>
+        <w:t>PÁGINA WEB:</w:t>
       </w:r>
       <w:bookmarkEnd w:id="4"/>
     </w:p>
-    <w:p/>
+    <w:p>
+      <w:pPr>
+        <w:pStyle w:val="Ttulo2"/>
+      </w:pPr>
+      <w:bookmarkStart w:id="5" w:name="_Toc242453930"/>
+      <w:r>
+        <w:t>APLICACIÓN WEB:</w:t>
+      </w:r>
+      <w:bookmarkEnd w:id="5"/>
+    </w:p>
+    <w:p>
+      <w:pPr>
+        <w:pStyle w:val="Ttulo2"/>
+      </w:pPr>
+      <w:bookmarkStart w:id="6" w:name="_Toc242453931"/>
+      <w:r>
+        <w:t>LA FORMA DE CONEXIÓN DE AMBAS</w:t>
+      </w:r>
+      <w:bookmarkEnd w:id="6"/>
+    </w:p>
     <w:p/>
     <w:p/>
     <w:p>
@@ -596,19 +1283,151 @@
           <w:numId w:val="11"/>
         </w:numPr>
       </w:pPr>
-      <w:bookmarkStart w:id="5" w:name="_Toc242202469"/>
+      <w:bookmarkStart w:id="7" w:name="_Toc242453932"/>
       <w:r>
-        <w:t>PROYECTO PROPIO DE PRUEBA:</w:t>
+        <w:t>INVESTIGACIÓN</w:t>
       </w:r>
-      <w:bookmarkEnd w:id="5"/>
+      <w:r>
+        <w:t>:</w:t>
+      </w:r>
+      <w:bookmarkEnd w:id="7"/>
     </w:p>
     <w:p>
       <w:pPr>
+        <w:pStyle w:val="Ttulo2"/>
+      </w:pPr>
+      <w:bookmarkStart w:id="8" w:name="_Toc242453933"/>
+      <w:r>
+        <w:t>LO MÁS COMPLEJO DE LA ACTIVIDAD:</w:t>
+      </w:r>
+      <w:bookmarkEnd w:id="8"/>
+    </w:p>
+    <w:p>
+      <w:pPr>
         <w:jc w:val="both"/>
+        <w:rPr>
+          <w:rFonts w:asciiTheme="majorHAnsi" w:hAnsiTheme="majorHAnsi" w:cstheme="majorHAnsi"/>
+          <w:sz w:val="24"/>
+          <w:szCs w:val="24"/>
+        </w:rPr>
+      </w:pPr>
+      <w:r>
+        <w:rPr>
+          <w:rFonts w:asciiTheme="majorHAnsi" w:hAnsiTheme="majorHAnsi" w:cstheme="majorHAnsi"/>
+          <w:sz w:val="24"/>
+          <w:szCs w:val="24"/>
+        </w:rPr>
+        <w:t>Lo más complejo fue articular la comunicación entre dos entornos desacoplados: el servidor web Apache sirviendo el frontend estático en el puerto 80 y la aplicación dinámica en Node.js sobre el puerto 3000, gestionando la navegación fluida y evitando bloqueos entre ambos servicios locales.</w:t>
+      </w:r>
+    </w:p>
+    <w:p>
+      <w:pPr>
+        <w:pStyle w:val="Ttulo3"/>
+      </w:pPr>
+      <w:bookmarkStart w:id="9" w:name="_Toc242453934"/>
+      <w:r>
+        <w:t>¿Cómo lo resolví?</w:t>
+      </w:r>
+      <w:bookmarkEnd w:id="9"/>
+    </w:p>
+    <w:p>
+      <w:pPr>
+        <w:jc w:val="both"/>
+        <w:rPr>
+          <w:rFonts w:asciiTheme="majorHAnsi" w:hAnsiTheme="majorHAnsi" w:cstheme="majorHAnsi"/>
+          <w:sz w:val="24"/>
+          <w:szCs w:val="24"/>
+        </w:rPr>
+      </w:pPr>
+      <w:r>
+        <w:rPr>
+          <w:rFonts w:asciiTheme="majorHAnsi" w:hAnsiTheme="majorHAnsi" w:cstheme="majorHAnsi"/>
+          <w:sz w:val="24"/>
+          <w:szCs w:val="24"/>
+        </w:rPr>
+        <w:t>Lo resolví configurando rutas absolutas y relativas explícitas en los enlaces de navegación, garantizando que el servicio de Node.js permanezca a la escucha en segundo plano y permitiendo que el usuario transicione entre la carta informativa y el armador interactivo de comandas de forma natural.</w:t>
+      </w:r>
+    </w:p>
+    <w:p>
+      <w:pPr>
+        <w:pStyle w:val="Ttulo2"/>
+      </w:pPr>
+      <w:bookmarkStart w:id="10" w:name="_Toc242453935"/>
+      <w:r>
+        <w:t>OTRO SERVIDOR WEB:</w:t>
+      </w:r>
+      <w:bookmarkEnd w:id="10"/>
+    </w:p>
+    <w:p>
+      <w:pPr>
+        <w:pStyle w:val="Ttulo3"/>
+        <w:jc w:val="both"/>
+        <w:rPr>
+          <w:rFonts w:eastAsiaTheme="minorHAnsi" w:cstheme="majorHAnsi"/>
+          <w:color w:val="auto"/>
+        </w:rPr>
+      </w:pPr>
+      <w:bookmarkStart w:id="11" w:name="_Toc242453936"/>
+      <w:r>
+        <w:rPr>
+          <w:rFonts w:eastAsiaTheme="minorHAnsi" w:cstheme="majorHAnsi"/>
+          <w:color w:val="auto"/>
+        </w:rPr>
+        <w:t>Nginx es un servidor web y proxy inverso de alto rendimiento. Destaca por su arquitectura asíncrona no bloqueante orientada a eventos, lo que le permite procesar peticiones web de forma muy ligera y eficiente.</w:t>
+      </w:r>
+    </w:p>
+    <w:p>
+      <w:pPr>
+        <w:pStyle w:val="Ttulo3"/>
+      </w:pPr>
+      <w:r>
+        <w:t>Comparado con Apache</w:t>
+      </w:r>
+      <w:bookmarkEnd w:id="11"/>
+    </w:p>
+    <w:p>
+      <w:pPr>
+        <w:jc w:val="both"/>
+        <w:rPr>
+          <w:rFonts w:asciiTheme="majorHAnsi" w:hAnsiTheme="majorHAnsi" w:cstheme="majorHAnsi"/>
+          <w:sz w:val="24"/>
+          <w:szCs w:val="24"/>
+        </w:rPr>
+      </w:pPr>
+      <w:r>
+        <w:rPr>
+          <w:rFonts w:asciiTheme="majorHAnsi" w:hAnsiTheme="majorHAnsi" w:cstheme="majorHAnsi"/>
+          <w:sz w:val="24"/>
+          <w:szCs w:val="24"/>
+        </w:rPr>
+        <w:t>A diferencia de Apache, que crea un proceso o hilo de ejecución por cada conexión entrante, Nginx atiende miles de peticiones simultáneas dentro de un único proceso de trabajo. Esto hace que Nginx consuma mucha menos me</w:t>
+      </w:r>
+      <w:bookmarkStart w:id="12" w:name="_GoBack"/>
+      <w:bookmarkEnd w:id="12"/>
+      <w:r>
+        <w:rPr>
+          <w:rFonts w:asciiTheme="majorHAnsi" w:hAnsiTheme="majorHAnsi" w:cstheme="majorHAnsi"/>
+          <w:sz w:val="24"/>
+          <w:szCs w:val="24"/>
+        </w:rPr>
+        <w:t>moria RAM y responda más rápido ante tráfico masivo.</w:t>
+      </w:r>
+    </w:p>
+    <w:p/>
+    <w:p/>
+    <w:p>
+      <w:pPr>
+        <w:jc w:val="both"/>
+        <w:rPr>
+          <w:rFonts w:asciiTheme="majorHAnsi" w:hAnsiTheme="majorHAnsi" w:cstheme="majorHAnsi"/>
+          <w:sz w:val="24"/>
+          <w:szCs w:val="24"/>
+        </w:rPr>
       </w:pPr>
     </w:p>
     <w:sectPr>
-      <w:footerReference w:type="default" r:id="rId8"/>
+      <w:headerReference w:type="default" r:id="rId9"/>
+      <w:footerReference w:type="default" r:id="rId10"/>
       <w:pgSz w:w="11906" w:h="16838"/>
       <w:pgMar w:top="1417" w:right="1701" w:bottom="1417" w:left="1701" w:header="708" w:footer="708" w:gutter="0"/>
       <w:cols w:space="708"/>
@@ -645,241 +1464,391 @@
 
 <file path=word/footer1.xml><?xml version="1.0" encoding="utf-8"?>
 <w:ftr xmlns:wpc="http://schemas.microsoft.com/office/word/2010/wordprocessingCanvas" xmlns:cx="http://schemas.microsoft.com/office/drawing/2014/chartex" xmlns:mc="http://schemas.openxmlformats.org/markup-compatibility/2006" xmlns:o="urn:schemas-microsoft-com:office:office" xmlns:r="http://schemas.openxmlformats.org/officeDocument/2006/relationships" xmlns:m="http://schemas.openxmlformats.org/officeDocument/2006/math" xmlns:v="urn:schemas-microsoft-com:vml" xmlns:wp14="http://schemas.microsoft.com/office/word/2010/wordprocessingDrawing" xmlns:wp="http://schemas.openxmlformats.org/drawingml/2006/wordprocessingDrawing" xmlns:w10="urn:schemas-microsoft-com:office:word" xmlns:w="http://schemas.openxmlformats.org/wordprocessingml/2006/main" xmlns:w14="http://schemas.microsoft.com/office/word/2010/wordml" xmlns:w15="http://schemas.microsoft.com/office/word/2012/wordml" xmlns:w16se="http://schemas.microsoft.com/office/word/2015/wordml/symex" xmlns:wpg="http://schemas.microsoft.com/office/word/2010/wordprocessingGroup" xmlns:wpi="http://schemas.microsoft.com/office/word/2010/wordprocessingInk" xmlns:wne="http://schemas.microsoft.com/office/word/2006/wordml" xmlns:wps="http://schemas.microsoft.com/office/word/2010/wordprocessingShape" mc:Ignorable="w14 w15 w16se wp14">
-  <w:sdt>
-    <w:sdtPr>
-      <w:id w:val="-1582060313"/>
-      <w:docPartObj>
-        <w:docPartGallery w:val="Page Numbers (Bottom of Page)"/>
-        <w:docPartUnique/>
-      </w:docPartObj>
-    </w:sdtPr>
-    <w:sdtEndPr>
+  <w:p>
+    <w:pPr>
+      <w:pStyle w:val="Piedepgina"/>
+      <w:jc w:val="center"/>
       <w:rPr>
         <w:b/>
       </w:rPr>
-    </w:sdtEndPr>
-    <w:sdtContent>
-      <w:p>
-        <w:pPr>
-          <w:pStyle w:val="Piedepgina"/>
-          <w:jc w:val="center"/>
-          <w:rPr>
-            <w:b/>
-          </w:rPr>
-        </w:pPr>
-        <w:r>
-          <w:rPr>
-            <w:b/>
-            <w:noProof/>
-            <w:lang w:eastAsia="es-ES"/>
-          </w:rPr>
-          <mc:AlternateContent>
-            <mc:Choice Requires="wpg">
-              <w:drawing>
-                <wp:anchor distT="0" distB="0" distL="114300" distR="114300" simplePos="0" relativeHeight="251659264" behindDoc="0" locked="0" layoutInCell="1" allowOverlap="1" wp14:anchorId="4B1F4071" wp14:editId="38EBD09A">
-                  <wp:simplePos x="0" y="0"/>
-                  <wp:positionH relativeFrom="margin">
-                    <wp:align>right</wp:align>
-                  </wp:positionH>
-                  <wp:positionV relativeFrom="page">
-                    <wp:align>bottom</wp:align>
-                  </wp:positionV>
-                  <wp:extent cx="436880" cy="716915"/>
-                  <wp:effectExtent l="7620" t="9525" r="12700" b="6985"/>
-                  <wp:wrapNone/>
-                  <wp:docPr id="8" name="Grupo 8"/>
-                  <wp:cNvGraphicFramePr>
-                    <a:graphicFrameLocks xmlns:a="http://schemas.openxmlformats.org/drawingml/2006/main"/>
-                  </wp:cNvGraphicFramePr>
-                  <a:graphic xmlns:a="http://schemas.openxmlformats.org/drawingml/2006/main">
-                    <a:graphicData uri="http://schemas.microsoft.com/office/word/2010/wordprocessingGroup">
-                      <wpg:wgp>
-                        <wpg:cNvGrpSpPr>
-                          <a:grpSpLocks/>
-                        </wpg:cNvGrpSpPr>
-                        <wpg:grpSpPr bwMode="auto">
-                          <a:xfrm>
-                            <a:off x="0" y="0"/>
-                            <a:ext cx="436880" cy="716915"/>
-                            <a:chOff x="1743" y="14699"/>
-                            <a:chExt cx="688" cy="1129"/>
-                          </a:xfrm>
-                        </wpg:grpSpPr>
-                        <wps:wsp>
-                          <wps:cNvPr id="9" name="AutoShape 77"/>
-                          <wps:cNvCnPr>
-                            <a:cxnSpLocks noChangeShapeType="1"/>
-                          </wps:cNvCnPr>
-                          <wps:spPr bwMode="auto">
-                            <a:xfrm flipV="1">
-                              <a:off x="2111" y="15387"/>
-                              <a:ext cx="0" cy="441"/>
-                            </a:xfrm>
-                            <a:prstGeom prst="straightConnector1">
-                              <a:avLst/>
-                            </a:prstGeom>
-                            <a:noFill/>
-                            <a:ln w="9525">
+    </w:pPr>
+    <w:r>
+      <w:rPr>
+        <w:b/>
+        <w:noProof/>
+        <w:lang w:eastAsia="es-ES"/>
+      </w:rPr>
+      <w:drawing>
+        <wp:anchor distT="0" distB="0" distL="114300" distR="114300" simplePos="0" relativeHeight="251663360" behindDoc="0" locked="0" layoutInCell="1" allowOverlap="1" wp14:anchorId="202A03EB" wp14:editId="776E22F8">
+          <wp:simplePos x="0" y="0"/>
+          <wp:positionH relativeFrom="margin">
+            <wp:posOffset>-733440</wp:posOffset>
+          </wp:positionH>
+          <wp:positionV relativeFrom="margin">
+            <wp:posOffset>9057448</wp:posOffset>
+          </wp:positionV>
+          <wp:extent cx="871855" cy="548640"/>
+          <wp:effectExtent l="0" t="0" r="4445" b="3810"/>
+          <wp:wrapSquare wrapText="bothSides"/>
+          <wp:docPr id="5" name="Imagen 5"/>
+          <wp:cNvGraphicFramePr>
+            <a:graphicFrameLocks xmlns:a="http://schemas.openxmlformats.org/drawingml/2006/main" noChangeAspect="1"/>
+          </wp:cNvGraphicFramePr>
+          <a:graphic xmlns:a="http://schemas.openxmlformats.org/drawingml/2006/main">
+            <a:graphicData uri="http://schemas.openxmlformats.org/drawingml/2006/picture">
+              <pic:pic xmlns:pic="http://schemas.openxmlformats.org/drawingml/2006/picture">
+                <pic:nvPicPr>
+                  <pic:cNvPr id="5" name="Gemini_Generated_Image_t3kc0tt3kc0tt3kc-removebg-preview.png"/>
+                  <pic:cNvPicPr/>
+                </pic:nvPicPr>
+                <pic:blipFill rotWithShape="1">
+                  <a:blip r:embed="rId1" cstate="print">
+                    <a:extLst>
+                      <a:ext uri="{28A0092B-C50C-407E-A947-70E740481C1C}">
+                        <a14:useLocalDpi xmlns:a14="http://schemas.microsoft.com/office/drawing/2010/main" val="0"/>
+                      </a:ext>
+                    </a:extLst>
+                  </a:blip>
+                  <a:srcRect l="13390" t="7417" r="12775" b="9233"/>
+                  <a:stretch/>
+                </pic:blipFill>
+                <pic:spPr bwMode="auto">
+                  <a:xfrm>
+                    <a:off x="0" y="0"/>
+                    <a:ext cx="871855" cy="548640"/>
+                  </a:xfrm>
+                  <a:prstGeom prst="rect">
+                    <a:avLst/>
+                  </a:prstGeom>
+                  <a:ln>
+                    <a:noFill/>
+                  </a:ln>
+                  <a:extLst>
+                    <a:ext uri="{53640926-AAD7-44D8-BBD7-CCE9431645EC}">
+                      <a14:shadowObscured xmlns:a14="http://schemas.microsoft.com/office/drawing/2010/main"/>
+                    </a:ext>
+                  </a:extLst>
+                </pic:spPr>
+              </pic:pic>
+            </a:graphicData>
+          </a:graphic>
+        </wp:anchor>
+      </w:drawing>
+    </w:r>
+    <w:r>
+      <w:rPr>
+        <w:noProof/>
+        <w:lang w:eastAsia="es-ES"/>
+      </w:rPr>
+      <mc:AlternateContent>
+        <mc:Choice Requires="wps">
+          <w:drawing>
+            <wp:anchor distT="0" distB="0" distL="114300" distR="114300" simplePos="0" relativeHeight="251665408" behindDoc="0" locked="0" layoutInCell="1" allowOverlap="1" wp14:anchorId="2C8BD881" wp14:editId="60EC8F23">
+              <wp:simplePos x="0" y="0"/>
+              <wp:positionH relativeFrom="column">
+                <wp:posOffset>-2968713</wp:posOffset>
+              </wp:positionH>
+              <wp:positionV relativeFrom="paragraph">
+                <wp:posOffset>-424756</wp:posOffset>
+              </wp:positionV>
+              <wp:extent cx="11573051" cy="381467"/>
+              <wp:effectExtent l="0" t="0" r="0" b="0"/>
+              <wp:wrapNone/>
+              <wp:docPr id="6" name="Menos 6"/>
+              <wp:cNvGraphicFramePr/>
+              <a:graphic xmlns:a="http://schemas.openxmlformats.org/drawingml/2006/main">
+                <a:graphicData uri="http://schemas.microsoft.com/office/word/2010/wordprocessingShape">
+                  <wps:wsp>
+                    <wps:cNvSpPr/>
+                    <wps:spPr>
+                      <a:xfrm>
+                        <a:off x="0" y="0"/>
+                        <a:ext cx="11573051" cy="381467"/>
+                      </a:xfrm>
+                      <a:prstGeom prst="mathMinus">
+                        <a:avLst/>
+                      </a:prstGeom>
+                    </wps:spPr>
+                    <wps:style>
+                      <a:lnRef idx="3">
+                        <a:schemeClr val="lt1"/>
+                      </a:lnRef>
+                      <a:fillRef idx="1">
+                        <a:schemeClr val="accent6"/>
+                      </a:fillRef>
+                      <a:effectRef idx="1">
+                        <a:schemeClr val="accent6"/>
+                      </a:effectRef>
+                      <a:fontRef idx="minor">
+                        <a:schemeClr val="lt1"/>
+                      </a:fontRef>
+                    </wps:style>
+                    <wps:bodyPr rot="0" spcFirstLastPara="0" vertOverflow="overflow" horzOverflow="overflow" vert="horz" wrap="square" lIns="91440" tIns="45720" rIns="91440" bIns="45720" numCol="1" spcCol="0" rtlCol="0" fromWordArt="0" anchor="ctr" anchorCtr="0" forceAA="0" compatLnSpc="1">
+                      <a:prstTxWarp prst="textNoShape">
+                        <a:avLst/>
+                      </a:prstTxWarp>
+                      <a:noAutofit/>
+                    </wps:bodyPr>
+                  </wps:wsp>
+                </a:graphicData>
+              </a:graphic>
+              <wp14:sizeRelH relativeFrom="margin">
+                <wp14:pctWidth>0</wp14:pctWidth>
+              </wp14:sizeRelH>
+              <wp14:sizeRelV relativeFrom="margin">
+                <wp14:pctHeight>0</wp14:pctHeight>
+              </wp14:sizeRelV>
+            </wp:anchor>
+          </w:drawing>
+        </mc:Choice>
+        <mc:Fallback>
+          <w:pict>
+            <v:shape w14:anchorId="480451FB" id="Menos 6" o:spid="_x0000_s1026" style="position:absolute;margin-left:-233.75pt;margin-top:-33.45pt;width:911.25pt;height:30.05pt;z-index:251665408;visibility:visible;mso-wrap-style:square;mso-width-percent:0;mso-height-percent:0;mso-wrap-distance-left:9pt;mso-wrap-distance-top:0;mso-wrap-distance-right:9pt;mso-wrap-distance-bottom:0;mso-position-horizontal:absolute;mso-position-horizontal-relative:text;mso-position-vertical:absolute;mso-position-vertical-relative:text;mso-width-percent:0;mso-height-percent:0;mso-width-relative:margin;mso-height-relative:margin;v-text-anchor:middle" coordsize="11573051,381467" o:gfxdata="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" path="m1534008,145873r8505035,l10039043,235594r-8505035,l1534008,145873xe" fillcolor="#f3e8d2 [3209]" strokecolor="white [3201]" strokeweight="1.5pt">
+              <v:stroke joinstyle="miter"/>
+              <v:path arrowok="t" o:connecttype="custom" o:connectlocs="1534008,145873;10039043,145873;10039043,235594;1534008,235594;1534008,145873" o:connectangles="0,0,0,0,0"/>
+            </v:shape>
+          </w:pict>
+        </mc:Fallback>
+      </mc:AlternateContent>
+    </w:r>
+    <w:r>
+      <w:rPr>
+        <w:b/>
+        <w:noProof/>
+        <w:lang w:eastAsia="es-ES"/>
+      </w:rPr>
+      <mc:AlternateContent>
+        <mc:Choice Requires="wpg">
+          <w:drawing>
+            <wp:anchor distT="0" distB="0" distL="114300" distR="114300" simplePos="0" relativeHeight="251659264" behindDoc="0" locked="0" layoutInCell="1" allowOverlap="1" wp14:anchorId="4B1F4071" wp14:editId="02FB3935">
+              <wp:simplePos x="0" y="0"/>
+              <wp:positionH relativeFrom="margin">
+                <wp:posOffset>5588413</wp:posOffset>
+              </wp:positionH>
+              <wp:positionV relativeFrom="page">
+                <wp:posOffset>10032026</wp:posOffset>
+              </wp:positionV>
+              <wp:extent cx="436880" cy="716915"/>
+              <wp:effectExtent l="7620" t="9525" r="12700" b="6985"/>
+              <wp:wrapNone/>
+              <wp:docPr id="8" name="Grupo 8"/>
+              <wp:cNvGraphicFramePr>
+                <a:graphicFrameLocks xmlns:a="http://schemas.openxmlformats.org/drawingml/2006/main"/>
+              </wp:cNvGraphicFramePr>
+              <a:graphic xmlns:a="http://schemas.openxmlformats.org/drawingml/2006/main">
+                <a:graphicData uri="http://schemas.microsoft.com/office/word/2010/wordprocessingGroup">
+                  <wpg:wgp>
+                    <wpg:cNvGrpSpPr>
+                      <a:grpSpLocks/>
+                    </wpg:cNvGrpSpPr>
+                    <wpg:grpSpPr bwMode="auto">
+                      <a:xfrm>
+                        <a:off x="0" y="0"/>
+                        <a:ext cx="436880" cy="716915"/>
+                        <a:chOff x="1743" y="14699"/>
+                        <a:chExt cx="688" cy="1129"/>
+                      </a:xfrm>
+                    </wpg:grpSpPr>
+                    <wps:wsp>
+                      <wps:cNvPr id="9" name="AutoShape 77"/>
+                      <wps:cNvCnPr>
+                        <a:cxnSpLocks noChangeShapeType="1"/>
+                      </wps:cNvCnPr>
+                      <wps:spPr bwMode="auto">
+                        <a:xfrm flipV="1">
+                          <a:off x="2111" y="15387"/>
+                          <a:ext cx="0" cy="441"/>
+                        </a:xfrm>
+                        <a:prstGeom prst="straightConnector1">
+                          <a:avLst/>
+                        </a:prstGeom>
+                        <a:noFill/>
+                        <a:ln w="9525">
+                          <a:solidFill>
+                            <a:srgbClr val="7F7F7F"/>
+                          </a:solidFill>
+                          <a:round/>
+                          <a:headEnd/>
+                          <a:tailEnd/>
+                        </a:ln>
+                        <a:extLst>
+                          <a:ext uri="{909E8E84-426E-40DD-AFC4-6F175D3DCCD1}">
+                            <a14:hiddenFill xmlns:a14="http://schemas.microsoft.com/office/drawing/2010/main">
+                              <a:noFill/>
+                            </a14:hiddenFill>
+                          </a:ext>
+                        </a:extLst>
+                      </wps:spPr>
+                      <wps:bodyPr/>
+                    </wps:wsp>
+                    <wps:wsp>
+                      <wps:cNvPr id="10" name="Rectangle 78"/>
+                      <wps:cNvSpPr>
+                        <a:spLocks noChangeArrowheads="1"/>
+                      </wps:cNvSpPr>
+                      <wps:spPr bwMode="auto">
+                        <a:xfrm>
+                          <a:off x="1743" y="14699"/>
+                          <a:ext cx="688" cy="688"/>
+                        </a:xfrm>
+                        <a:prstGeom prst="rect">
+                          <a:avLst/>
+                        </a:prstGeom>
+                        <a:noFill/>
+                        <a:ln w="9525">
+                          <a:solidFill>
+                            <a:srgbClr val="7F7F7F"/>
+                          </a:solidFill>
+                          <a:miter lim="800000"/>
+                          <a:headEnd/>
+                          <a:tailEnd/>
+                        </a:ln>
+                        <a:extLst>
+                          <a:ext uri="{909E8E84-426E-40DD-AFC4-6F175D3DCCD1}">
+                            <a14:hiddenFill xmlns:a14="http://schemas.microsoft.com/office/drawing/2010/main">
                               <a:solidFill>
-                                <a:srgbClr val="7F7F7F"/>
+                                <a:srgbClr val="FFFFFF"/>
                               </a:solidFill>
-                              <a:round/>
-                              <a:headEnd/>
-                              <a:tailEnd/>
-                            </a:ln>
-                            <a:extLst>
-                              <a:ext uri="{909E8E84-426E-40DD-AFC4-6F175D3DCCD1}">
-                                <a14:hiddenFill xmlns:a14="http://schemas.microsoft.com/office/drawing/2010/main">
-                                  <a:noFill/>
-                                </a14:hiddenFill>
-                              </a:ext>
-                            </a:extLst>
-                          </wps:spPr>
-                          <wps:bodyPr/>
-                        </wps:wsp>
-                        <wps:wsp>
-                          <wps:cNvPr id="10" name="Rectangle 78"/>
-                          <wps:cNvSpPr>
-                            <a:spLocks noChangeArrowheads="1"/>
-                          </wps:cNvSpPr>
-                          <wps:spPr bwMode="auto">
-                            <a:xfrm>
-                              <a:off x="1743" y="14699"/>
-                              <a:ext cx="688" cy="688"/>
-                            </a:xfrm>
-                            <a:prstGeom prst="rect">
-                              <a:avLst/>
-                            </a:prstGeom>
-                            <a:noFill/>
-                            <a:ln w="9525">
-                              <a:solidFill>
-                                <a:srgbClr val="7F7F7F"/>
-                              </a:solidFill>
-                              <a:miter lim="800000"/>
-                              <a:headEnd/>
-                              <a:tailEnd/>
-                            </a:ln>
-                            <a:extLst>
-                              <a:ext uri="{909E8E84-426E-40DD-AFC4-6F175D3DCCD1}">
-                                <a14:hiddenFill xmlns:a14="http://schemas.microsoft.com/office/drawing/2010/main">
-                                  <a:solidFill>
-                                    <a:srgbClr val="FFFFFF"/>
-                                  </a:solidFill>
-                                </a14:hiddenFill>
-                              </a:ext>
-                            </a:extLst>
-                          </wps:spPr>
-                          <wps:txbx>
-                            <w:txbxContent>
-                              <w:p>
-                                <w:pPr>
-                                  <w:pStyle w:val="Piedepgina"/>
-                                  <w:jc w:val="center"/>
-                                  <w:rPr>
-                                    <w:sz w:val="16"/>
-                                    <w:szCs w:val="16"/>
-                                  </w:rPr>
-                                </w:pPr>
-                                <w:r>
-                                  <w:fldChar w:fldCharType="begin"/>
-                                </w:r>
-                                <w:r>
-                                  <w:instrText>PAGE    \* MERGEFORMAT</w:instrText>
-                                </w:r>
-                                <w:r>
-                                  <w:fldChar w:fldCharType="separate"/>
-                                </w:r>
-                                <w:r>
-                                  <w:rPr>
-                                    <w:noProof/>
-                                    <w:sz w:val="16"/>
-                                    <w:szCs w:val="16"/>
-                                  </w:rPr>
-                                  <w:t>1</w:t>
-                                </w:r>
-                                <w:r>
-                                  <w:rPr>
-                                    <w:sz w:val="16"/>
-                                    <w:szCs w:val="16"/>
-                                  </w:rPr>
-                                  <w:fldChar w:fldCharType="end"/>
-                                </w:r>
-                              </w:p>
-                            </w:txbxContent>
-                          </wps:txbx>
-                          <wps:bodyPr rot="0" vert="horz" wrap="square" lIns="91440" tIns="45720" rIns="91440" bIns="45720" anchor="ctr" anchorCtr="0" upright="1">
-                            <a:noAutofit/>
-                          </wps:bodyPr>
-                        </wps:wsp>
-                      </wpg:wgp>
-                    </a:graphicData>
-                  </a:graphic>
-                  <wp14:sizeRelH relativeFrom="page">
-                    <wp14:pctWidth>0</wp14:pctWidth>
-                  </wp14:sizeRelH>
-                  <wp14:sizeRelV relativeFrom="page">
-                    <wp14:pctHeight>0</wp14:pctHeight>
-                  </wp14:sizeRelV>
-                </wp:anchor>
-              </w:drawing>
-            </mc:Choice>
-            <mc:Fallback>
-              <w:pict>
-                <v:group w14:anchorId="4B1F4071" id="Grupo 8" o:spid="_x0000_s1026" style="position:absolute;left:0;text-align:left;margin-left:-16.8pt;margin-top:0;width:34.4pt;height:56.45pt;z-index:251659264;mso-position-horizontal:right;mso-position-horizontal-relative:margin;mso-position-vertical:bottom;mso-position-vertical-relative:page" coordorigin="1743,14699" coordsize="688,1129" o:gfxdata="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">
-                  <v:shapetype id="_x0000_t32" coordsize="21600,21600" o:spt="32" o:oned="t" path="m,l21600,21600e" filled="f">
-                    <v:path arrowok="t" fillok="f" o:connecttype="none"/>
-                    <o:lock v:ext="edit" shapetype="t"/>
-                  </v:shapetype>
-                  <v:shape id="AutoShape 77" o:spid="_x0000_s1027" type="#_x0000_t32" style="position:absolute;left:2111;top:15387;width:0;height:441;flip:y;visibility:visible;mso-wrap-style:square" o:connectortype="straight" o:gfxdata="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" strokecolor="#7f7f7f"/>
-                  <v:rect id="Rectangle 78" o:spid="_x0000_s1028" style="position:absolute;left:1743;top:14699;width:688;height:688;visibility:visible;mso-wrap-style:square;v-text-anchor:middle" o:gfxdata="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" filled="f" strokecolor="#7f7f7f">
-                    <v:textbox>
-                      <w:txbxContent>
-                        <w:p>
-                          <w:pPr>
-                            <w:pStyle w:val="Piedepgina"/>
-                            <w:jc w:val="center"/>
-                            <w:rPr>
-                              <w:sz w:val="16"/>
-                              <w:szCs w:val="16"/>
-                            </w:rPr>
-                          </w:pPr>
-                          <w:r>
-                            <w:fldChar w:fldCharType="begin"/>
-                          </w:r>
-                          <w:r>
-                            <w:instrText>PAGE    \* MERGEFORMAT</w:instrText>
-                          </w:r>
-                          <w:r>
-                            <w:fldChar w:fldCharType="separate"/>
-                          </w:r>
-                          <w:r>
-                            <w:rPr>
-                              <w:noProof/>
-                              <w:sz w:val="16"/>
-                              <w:szCs w:val="16"/>
-                            </w:rPr>
-                            <w:t>1</w:t>
-                          </w:r>
-                          <w:r>
-                            <w:rPr>
-                              <w:sz w:val="16"/>
-                              <w:szCs w:val="16"/>
-                            </w:rPr>
-                            <w:fldChar w:fldCharType="end"/>
-                          </w:r>
-                        </w:p>
-                      </w:txbxContent>
-                    </v:textbox>
-                  </v:rect>
-                  <w10:wrap anchorx="margin" anchory="page"/>
-                </v:group>
-              </w:pict>
-            </mc:Fallback>
-          </mc:AlternateContent>
-        </w:r>
-      </w:p>
-    </w:sdtContent>
-  </w:sdt>
+                            </a14:hiddenFill>
+                          </a:ext>
+                        </a:extLst>
+                      </wps:spPr>
+                      <wps:txbx>
+                        <w:txbxContent>
+                          <w:p>
+                            <w:pPr>
+                              <w:pStyle w:val="Piedepgina"/>
+                              <w:jc w:val="center"/>
+                              <w:rPr>
+                                <w:sz w:val="16"/>
+                                <w:szCs w:val="16"/>
+                              </w:rPr>
+                            </w:pPr>
+                            <w:r>
+                              <w:fldChar w:fldCharType="begin"/>
+                            </w:r>
+                            <w:r>
+                              <w:instrText>PAGE    \* MERGEFORMAT</w:instrText>
+                            </w:r>
+                            <w:r>
+                              <w:fldChar w:fldCharType="separate"/>
+                            </w:r>
+                            <w:r>
+                              <w:rPr>
+                                <w:noProof/>
+                                <w:sz w:val="16"/>
+                                <w:szCs w:val="16"/>
+                              </w:rPr>
+                              <w:t>4</w:t>
+                            </w:r>
+                            <w:r>
+                              <w:rPr>
+                                <w:sz w:val="16"/>
+                                <w:szCs w:val="16"/>
+                              </w:rPr>
+                              <w:fldChar w:fldCharType="end"/>
+                            </w:r>
+                          </w:p>
+                        </w:txbxContent>
+                      </wps:txbx>
+                      <wps:bodyPr rot="0" vert="horz" wrap="square" lIns="91440" tIns="45720" rIns="91440" bIns="45720" anchor="ctr" anchorCtr="0" upright="1">
+                        <a:noAutofit/>
+                      </wps:bodyPr>
+                    </wps:wsp>
+                  </wpg:wgp>
+                </a:graphicData>
+              </a:graphic>
+              <wp14:sizeRelH relativeFrom="page">
+                <wp14:pctWidth>0</wp14:pctWidth>
+              </wp14:sizeRelH>
+              <wp14:sizeRelV relativeFrom="page">
+                <wp14:pctHeight>0</wp14:pctHeight>
+              </wp14:sizeRelV>
+            </wp:anchor>
+          </w:drawing>
+        </mc:Choice>
+        <mc:Fallback>
+          <w:pict>
+            <v:group w14:anchorId="4B1F4071" id="Grupo 8" o:spid="_x0000_s1026" style="position:absolute;left:0;text-align:left;margin-left:440.05pt;margin-top:789.9pt;width:34.4pt;height:56.45pt;z-index:251659264;mso-position-horizontal-relative:margin;mso-position-vertical-relative:page" coordorigin="1743,14699" coordsize="688,1129" o:gfxdata="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">
+              <v:shapetype id="_x0000_t32" coordsize="21600,21600" o:spt="32" o:oned="t" path="m,l21600,21600e" filled="f">
+                <v:path arrowok="t" fillok="f" o:connecttype="none"/>
+                <o:lock v:ext="edit" shapetype="t"/>
+              </v:shapetype>
+              <v:shape id="AutoShape 77" o:spid="_x0000_s1027" type="#_x0000_t32" style="position:absolute;left:2111;top:15387;width:0;height:441;flip:y;visibility:visible;mso-wrap-style:square" o:connectortype="straight" o:gfxdata="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" strokecolor="#7f7f7f"/>
+              <v:rect id="Rectangle 78" o:spid="_x0000_s1028" style="position:absolute;left:1743;top:14699;width:688;height:688;visibility:visible;mso-wrap-style:square;v-text-anchor:middle" o:gfxdata="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" filled="f" strokecolor="#7f7f7f">
+                <v:textbox>
+                  <w:txbxContent>
+                    <w:p>
+                      <w:pPr>
+                        <w:pStyle w:val="Piedepgina"/>
+                        <w:jc w:val="center"/>
+                        <w:rPr>
+                          <w:sz w:val="16"/>
+                          <w:szCs w:val="16"/>
+                        </w:rPr>
+                      </w:pPr>
+                      <w:r>
+                        <w:fldChar w:fldCharType="begin"/>
+                      </w:r>
+                      <w:r>
+                        <w:instrText>PAGE    \* MERGEFORMAT</w:instrText>
+                      </w:r>
+                      <w:r>
+                        <w:fldChar w:fldCharType="separate"/>
+                      </w:r>
+                      <w:r>
+                        <w:rPr>
+                          <w:noProof/>
+                          <w:sz w:val="16"/>
+                          <w:szCs w:val="16"/>
+                        </w:rPr>
+                        <w:t>4</w:t>
+                      </w:r>
+                      <w:r>
+                        <w:rPr>
+                          <w:sz w:val="16"/>
+                          <w:szCs w:val="16"/>
+                        </w:rPr>
+                        <w:fldChar w:fldCharType="end"/>
+                      </w:r>
+                    </w:p>
+                  </w:txbxContent>
+                </v:textbox>
+              </v:rect>
+              <w10:wrap anchorx="margin" anchory="page"/>
+            </v:group>
+          </w:pict>
+        </mc:Fallback>
+      </mc:AlternateContent>
+    </w:r>
+    <w:sdt>
+      <w:sdtPr>
+        <w:id w:val="-1582060313"/>
+        <w:docPartObj>
+          <w:docPartGallery w:val="Page Numbers (Bottom of Page)"/>
+          <w:docPartUnique/>
+        </w:docPartObj>
+      </w:sdtPr>
+      <w:sdtEndPr>
+        <w:rPr>
+          <w:b/>
+        </w:rPr>
+      </w:sdtEndPr>
+      <w:sdtContent/>
+    </w:sdt>
+    <w:r>
+      <w:rPr>
+        <w:b/>
+      </w:rPr>
+      <w:t xml:space="preserve">DESPLIEGUE DE APLICACIONES WEB </w:t>
+    </w:r>
+    <w:r>
+      <w:rPr>
+        <w:b/>
+      </w:rPr>
+      <w:t xml:space="preserve">| FRANCELLA ROJAS | JOSE LUIS ARGUMOSA                                             </w:t>
+    </w:r>
+  </w:p>
 </w:ftr>
 </file>
 
@@ -906,6 +1875,224 @@
     </w:p>
   </w:footnote>
 </w:footnotes>
+</file>
+
+<file path=word/header1.xml><?xml version="1.0" encoding="utf-8"?>
+<w:hdr xmlns:wpc="http://schemas.microsoft.com/office/word/2010/wordprocessingCanvas" xmlns:cx="http://schemas.microsoft.com/office/drawing/2014/chartex" xmlns:mc="http://schemas.openxmlformats.org/markup-compatibility/2006" xmlns:o="urn:schemas-microsoft-com:office:office" xmlns:r="http://schemas.openxmlformats.org/officeDocument/2006/relationships" xmlns:m="http://schemas.openxmlformats.org/officeDocument/2006/math" xmlns:v="urn:schemas-microsoft-com:vml" xmlns:wp14="http://schemas.microsoft.com/office/word/2010/wordprocessingDrawing" xmlns:wp="http://schemas.openxmlformats.org/drawingml/2006/wordprocessingDrawing" xmlns:w10="urn:schemas-microsoft-com:office:word" xmlns:w="http://schemas.openxmlformats.org/wordprocessingml/2006/main" xmlns:w14="http://schemas.microsoft.com/office/word/2010/wordml" xmlns:w15="http://schemas.microsoft.com/office/word/2012/wordml" xmlns:w16se="http://schemas.microsoft.com/office/word/2015/wordml/symex" xmlns:wpg="http://schemas.microsoft.com/office/word/2010/wordprocessingGroup" xmlns:wpi="http://schemas.microsoft.com/office/word/2010/wordprocessingInk" xmlns:wne="http://schemas.microsoft.com/office/word/2006/wordml" xmlns:wps="http://schemas.microsoft.com/office/word/2010/wordprocessingShape" mc:Ignorable="w14 w15 w16se wp14">
+  <w:p>
+    <w:pPr>
+      <w:pStyle w:val="Encabezado"/>
+      <w:rPr>
+        <w:b/>
+        <w:color w:val="96371E" w:themeColor="accent3" w:themeShade="BF"/>
+        <w:sz w:val="20"/>
+        <w:szCs w:val="20"/>
+      </w:rPr>
+    </w:pPr>
+    <w:r>
+      <w:rPr>
+        <w:noProof/>
+        <w:lang w:eastAsia="es-ES"/>
+      </w:rPr>
+      <mc:AlternateContent>
+        <mc:Choice Requires="wps">
+          <w:drawing>
+            <wp:anchor distT="0" distB="0" distL="114300" distR="114300" simplePos="0" relativeHeight="251662336" behindDoc="0" locked="0" layoutInCell="1" allowOverlap="1" wp14:anchorId="7D80B24D" wp14:editId="4E7F16B5">
+              <wp:simplePos x="0" y="0"/>
+              <wp:positionH relativeFrom="column">
+                <wp:posOffset>-2919220</wp:posOffset>
+              </wp:positionH>
+              <wp:positionV relativeFrom="paragraph">
+                <wp:posOffset>224533</wp:posOffset>
+              </wp:positionV>
+              <wp:extent cx="11573051" cy="381467"/>
+              <wp:effectExtent l="0" t="0" r="0" b="0"/>
+              <wp:wrapNone/>
+              <wp:docPr id="4" name="Menos 4"/>
+              <wp:cNvGraphicFramePr/>
+              <a:graphic xmlns:a="http://schemas.openxmlformats.org/drawingml/2006/main">
+                <a:graphicData uri="http://schemas.microsoft.com/office/word/2010/wordprocessingShape">
+                  <wps:wsp>
+                    <wps:cNvSpPr/>
+                    <wps:spPr>
+                      <a:xfrm>
+                        <a:off x="0" y="0"/>
+                        <a:ext cx="11573051" cy="381467"/>
+                      </a:xfrm>
+                      <a:prstGeom prst="mathMinus">
+                        <a:avLst/>
+                      </a:prstGeom>
+                    </wps:spPr>
+                    <wps:style>
+                      <a:lnRef idx="3">
+                        <a:schemeClr val="lt1"/>
+                      </a:lnRef>
+                      <a:fillRef idx="1">
+                        <a:schemeClr val="accent6"/>
+                      </a:fillRef>
+                      <a:effectRef idx="1">
+                        <a:schemeClr val="accent6"/>
+                      </a:effectRef>
+                      <a:fontRef idx="minor">
+                        <a:schemeClr val="lt1"/>
+                      </a:fontRef>
+                    </wps:style>
+                    <wps:bodyPr rot="0" spcFirstLastPara="0" vertOverflow="overflow" horzOverflow="overflow" vert="horz" wrap="square" lIns="91440" tIns="45720" rIns="91440" bIns="45720" numCol="1" spcCol="0" rtlCol="0" fromWordArt="0" anchor="ctr" anchorCtr="0" forceAA="0" compatLnSpc="1">
+                      <a:prstTxWarp prst="textNoShape">
+                        <a:avLst/>
+                      </a:prstTxWarp>
+                      <a:noAutofit/>
+                    </wps:bodyPr>
+                  </wps:wsp>
+                </a:graphicData>
+              </a:graphic>
+              <wp14:sizeRelH relativeFrom="margin">
+                <wp14:pctWidth>0</wp14:pctWidth>
+              </wp14:sizeRelH>
+              <wp14:sizeRelV relativeFrom="margin">
+                <wp14:pctHeight>0</wp14:pctHeight>
+              </wp14:sizeRelV>
+            </wp:anchor>
+          </w:drawing>
+        </mc:Choice>
+        <mc:Fallback>
+          <w:pict>
+            <v:shape w14:anchorId="6A30CE7D" id="Menos 4" o:spid="_x0000_s1026" style="position:absolute;margin-left:-229.85pt;margin-top:17.7pt;width:911.25pt;height:30.05pt;z-index:251662336;visibility:visible;mso-wrap-style:square;mso-width-percent:0;mso-height-percent:0;mso-wrap-distance-left:9pt;mso-wrap-distance-top:0;mso-wrap-distance-right:9pt;mso-wrap-distance-bottom:0;mso-position-horizontal:absolute;mso-position-horizontal-relative:text;mso-position-vertical:absolute;mso-position-vertical-relative:text;mso-width-percent:0;mso-height-percent:0;mso-width-relative:margin;mso-height-relative:margin;v-text-anchor:middle" coordsize="11573051,381467" o:gfxdata="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" path="m1534008,145873r8505035,l10039043,235594r-8505035,l1534008,145873xe" fillcolor="#f3e8d2 [3209]" strokecolor="white [3201]" strokeweight="1.5pt">
+              <v:stroke joinstyle="miter"/>
+              <v:path arrowok="t" o:connecttype="custom" o:connectlocs="1534008,145873;10039043,145873;10039043,235594;1534008,235594;1534008,145873" o:connectangles="0,0,0,0,0"/>
+            </v:shape>
+          </w:pict>
+        </mc:Fallback>
+      </mc:AlternateContent>
+    </w:r>
+    <w:r>
+      <w:rPr>
+        <w:noProof/>
+        <w:lang w:eastAsia="es-ES"/>
+      </w:rPr>
+      <mc:AlternateContent>
+        <mc:Choice Requires="wps">
+          <w:drawing>
+            <wp:anchor distT="0" distB="0" distL="114300" distR="114300" simplePos="0" relativeHeight="251660288" behindDoc="0" locked="0" layoutInCell="1" allowOverlap="1" wp14:anchorId="1C3173C9" wp14:editId="6EE1D9BB">
+              <wp:simplePos x="0" y="0"/>
+              <wp:positionH relativeFrom="column">
+                <wp:posOffset>-3071125</wp:posOffset>
+              </wp:positionH>
+              <wp:positionV relativeFrom="paragraph">
+                <wp:posOffset>71934</wp:posOffset>
+              </wp:positionV>
+              <wp:extent cx="11573051" cy="381467"/>
+              <wp:effectExtent l="0" t="0" r="0" b="0"/>
+              <wp:wrapNone/>
+              <wp:docPr id="3" name="Menos 3"/>
+              <wp:cNvGraphicFramePr/>
+              <a:graphic xmlns:a="http://schemas.openxmlformats.org/drawingml/2006/main">
+                <a:graphicData uri="http://schemas.microsoft.com/office/word/2010/wordprocessingShape">
+                  <wps:wsp>
+                    <wps:cNvSpPr/>
+                    <wps:spPr>
+                      <a:xfrm>
+                        <a:off x="0" y="0"/>
+                        <a:ext cx="11573051" cy="381467"/>
+                      </a:xfrm>
+                      <a:prstGeom prst="mathMinus">
+                        <a:avLst/>
+                      </a:prstGeom>
+                    </wps:spPr>
+                    <wps:style>
+                      <a:lnRef idx="3">
+                        <a:schemeClr val="lt1"/>
+                      </a:lnRef>
+                      <a:fillRef idx="1">
+                        <a:schemeClr val="accent2"/>
+                      </a:fillRef>
+                      <a:effectRef idx="1">
+                        <a:schemeClr val="accent2"/>
+                      </a:effectRef>
+                      <a:fontRef idx="minor">
+                        <a:schemeClr val="lt1"/>
+                      </a:fontRef>
+                    </wps:style>
+                    <wps:bodyPr rot="0" spcFirstLastPara="0" vertOverflow="overflow" horzOverflow="overflow" vert="horz" wrap="square" lIns="91440" tIns="45720" rIns="91440" bIns="45720" numCol="1" spcCol="0" rtlCol="0" fromWordArt="0" anchor="ctr" anchorCtr="0" forceAA="0" compatLnSpc="1">
+                      <a:prstTxWarp prst="textNoShape">
+                        <a:avLst/>
+                      </a:prstTxWarp>
+                      <a:noAutofit/>
+                    </wps:bodyPr>
+                  </wps:wsp>
+                </a:graphicData>
+              </a:graphic>
+              <wp14:sizeRelH relativeFrom="margin">
+                <wp14:pctWidth>0</wp14:pctWidth>
+              </wp14:sizeRelH>
+              <wp14:sizeRelV relativeFrom="margin">
+                <wp14:pctHeight>0</wp14:pctHeight>
+              </wp14:sizeRelV>
+            </wp:anchor>
+          </w:drawing>
+        </mc:Choice>
+        <mc:Fallback>
+          <w:pict>
+            <v:shape w14:anchorId="72A38C3F" id="Menos 3" o:spid="_x0000_s1026" style="position:absolute;margin-left:-241.8pt;margin-top:5.65pt;width:911.25pt;height:30.05pt;z-index:251660288;visibility:visible;mso-wrap-style:square;mso-width-percent:0;mso-height-percent:0;mso-wrap-distance-left:9pt;mso-wrap-distance-top:0;mso-wrap-distance-right:9pt;mso-wrap-distance-bottom:0;mso-position-horizontal:absolute;mso-position-horizontal-relative:text;mso-position-vertical:absolute;mso-position-vertical-relative:text;mso-width-percent:0;mso-height-percent:0;mso-width-relative:margin;mso-height-relative:margin;v-text-anchor:middle" coordsize="11573051,381467" o:gfxdata="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" path="m1534008,145873r8505035,l10039043,235594r-8505035,l1534008,145873xe" fillcolor="#2e7d32 [3205]" strokecolor="white [3201]" strokeweight="1.5pt">
+              <v:stroke joinstyle="miter"/>
+              <v:path arrowok="t" o:connecttype="custom" o:connectlocs="1534008,145873;10039043,145873;10039043,235594;1534008,235594;1534008,145873" o:connectangles="0,0,0,0,0"/>
+            </v:shape>
+          </w:pict>
+        </mc:Fallback>
+      </mc:AlternateContent>
+    </w:r>
+    <w:r>
+      <w:rPr>
+        <w:b/>
+        <w:color w:val="96371E" w:themeColor="accent3" w:themeShade="BF"/>
+        <w:sz w:val="20"/>
+        <w:szCs w:val="20"/>
+      </w:rPr>
+      <w:t>Arquitecturas W</w:t>
+    </w:r>
+    <w:r>
+      <w:rPr>
+        <w:b/>
+        <w:color w:val="96371E" w:themeColor="accent3" w:themeShade="BF"/>
+        <w:sz w:val="20"/>
+        <w:szCs w:val="20"/>
+      </w:rPr>
+      <w:t>eb | Práctica 3</w:t>
+    </w:r>
+    <w:r>
+      <w:rPr>
+        <w:b/>
+        <w:color w:val="96371E" w:themeColor="accent3" w:themeShade="BF"/>
+        <w:sz w:val="20"/>
+        <w:szCs w:val="20"/>
+      </w:rPr>
+      <w:t xml:space="preserve">                   </w:t>
+    </w:r>
+    <w:r>
+      <w:rPr>
+        <w:b/>
+        <w:color w:val="96371E" w:themeColor="accent3" w:themeShade="BF"/>
+        <w:sz w:val="20"/>
+        <w:szCs w:val="20"/>
+      </w:rPr>
+      <w:t xml:space="preserve">                                                                   </w:t>
+    </w:r>
+    <w:r>
+      <w:rPr>
+        <w:b/>
+        <w:color w:val="96371E" w:themeColor="accent3" w:themeShade="BF"/>
+        <w:sz w:val="20"/>
+        <w:szCs w:val="20"/>
+      </w:rPr>
+      <w:t>STACK: The Artisan Melt</w:t>
+    </w:r>
+  </w:p>
+  <w:p>
+    <w:pPr>
+      <w:pStyle w:val="Encabezado"/>
+    </w:pPr>
+  </w:p>
+</w:hdr>
 </file>
 
 <file path=word/numbering.xml><?xml version="1.0" encoding="utf-8"?>
@@ -1178,6 +2365,95 @@
     </w:lvl>
   </w:abstractNum>
   <w:abstractNum w:abstractNumId="3" w15:restartNumberingAfterBreak="0">
+    <w:nsid w:val="17EB4854"/>
+    <w:multiLevelType w:val="hybridMultilevel"/>
+    <w:tmpl w:val="7E6ED49E"/>
+    <w:lvl w:ilvl="0" w:tplc="0C0A000F">
+      <w:start w:val="1"/>
+      <w:numFmt w:val="decimal"/>
+      <w:lvlText w:val="%1."/>
+      <w:lvlJc w:val="left"/>
+      <w:pPr>
+        <w:ind w:left="720" w:hanging="360"/>
+      </w:pPr>
+      <w:rPr>
+        <w:rFonts w:hint="default"/>
+      </w:rPr>
+    </w:lvl>
+    <w:lvl w:ilvl="1" w:tplc="0C0A0019" w:tentative="1">
+      <w:start w:val="1"/>
+      <w:numFmt w:val="lowerLetter"/>
+      <w:lvlText w:val="%2."/>
+      <w:lvlJc w:val="left"/>
+      <w:pPr>
+        <w:ind w:left="1440" w:hanging="360"/>
+      </w:pPr>
+    </w:lvl>
+    <w:lvl w:ilvl="2" w:tplc="0C0A001B" w:tentative="1">
+      <w:start w:val="1"/>
+      <w:numFmt w:val="lowerRoman"/>
+      <w:lvlText w:val="%3."/>
+      <w:lvlJc w:val="right"/>
+      <w:pPr>
+        <w:ind w:left="2160" w:hanging="180"/>
+      </w:pPr>
+    </w:lvl>
+    <w:lvl w:ilvl="3" w:tplc="0C0A000F" w:tentative="1">
+      <w:start w:val="1"/>
+      <w:numFmt w:val="decimal"/>
+      <w:lvlText w:val="%4."/>
+      <w:lvlJc w:val="left"/>
+      <w:pPr>
+        <w:ind w:left="2880" w:hanging="360"/>
+      </w:pPr>
+    </w:lvl>
+    <w:lvl w:ilvl="4" w:tplc="0C0A0019" w:tentative="1">
+      <w:start w:val="1"/>
+      <w:numFmt w:val="lowerLetter"/>
+      <w:lvlText w:val="%5."/>
+      <w:lvlJc w:val="left"/>
+      <w:pPr>
+        <w:ind w:left="3600" w:hanging="360"/>
+      </w:pPr>
+    </w:lvl>
+    <w:lvl w:ilvl="5" w:tplc="0C0A001B" w:tentative="1">
+      <w:start w:val="1"/>
+      <w:numFmt w:val="lowerRoman"/>
+      <w:lvlText w:val="%6."/>
+      <w:lvlJc w:val="right"/>
+      <w:pPr>
+        <w:ind w:left="4320" w:hanging="180"/>
+      </w:pPr>
+    </w:lvl>
+    <w:lvl w:ilvl="6" w:tplc="0C0A000F" w:tentative="1">
+      <w:start w:val="1"/>
+      <w:numFmt w:val="decimal"/>
+      <w:lvlText w:val="%7."/>
+      <w:lvlJc w:val="left"/>
+      <w:pPr>
+        <w:ind w:left="5040" w:hanging="360"/>
+      </w:pPr>
+    </w:lvl>
+    <w:lvl w:ilvl="7" w:tplc="0C0A0019" w:tentative="1">
+      <w:start w:val="1"/>
+      <w:numFmt w:val="lowerLetter"/>
+      <w:lvlText w:val="%8."/>
+      <w:lvlJc w:val="left"/>
+      <w:pPr>
+        <w:ind w:left="5760" w:hanging="360"/>
+      </w:pPr>
+    </w:lvl>
+    <w:lvl w:ilvl="8" w:tplc="0C0A001B" w:tentative="1">
+      <w:start w:val="1"/>
+      <w:numFmt w:val="lowerRoman"/>
+      <w:lvlText w:val="%9."/>
+      <w:lvlJc w:val="right"/>
+      <w:pPr>
+        <w:ind w:left="6480" w:hanging="180"/>
+      </w:pPr>
+    </w:lvl>
+  </w:abstractNum>
+  <w:abstractNum w:abstractNumId="4" w15:restartNumberingAfterBreak="0">
     <w:nsid w:val="187E6151"/>
     <w:multiLevelType w:val="hybridMultilevel"/>
     <w:tmpl w:val="7E6ED49E"/>
@@ -1266,7 +2542,7 @@
       </w:pPr>
     </w:lvl>
   </w:abstractNum>
-  <w:abstractNum w:abstractNumId="4" w15:restartNumberingAfterBreak="0">
+  <w:abstractNum w:abstractNumId="5" w15:restartNumberingAfterBreak="0">
     <w:nsid w:val="2F435C38"/>
     <w:multiLevelType w:val="hybridMultilevel"/>
     <w:tmpl w:val="7E6ED49E"/>
@@ -1355,7 +2631,7 @@
       </w:pPr>
     </w:lvl>
   </w:abstractNum>
-  <w:abstractNum w:abstractNumId="5" w15:restartNumberingAfterBreak="0">
+  <w:abstractNum w:abstractNumId="6" w15:restartNumberingAfterBreak="0">
     <w:nsid w:val="36452F77"/>
     <w:multiLevelType w:val="hybridMultilevel"/>
     <w:tmpl w:val="7E6ED49E"/>
@@ -1444,7 +2720,7 @@
       </w:pPr>
     </w:lvl>
   </w:abstractNum>
-  <w:abstractNum w:abstractNumId="6" w15:restartNumberingAfterBreak="0">
+  <w:abstractNum w:abstractNumId="7" w15:restartNumberingAfterBreak="0">
     <w:nsid w:val="3AB02897"/>
     <w:multiLevelType w:val="hybridMultilevel"/>
     <w:tmpl w:val="7E6ED49E"/>
@@ -1533,7 +2809,7 @@
       </w:pPr>
     </w:lvl>
   </w:abstractNum>
-  <w:abstractNum w:abstractNumId="7" w15:restartNumberingAfterBreak="0">
+  <w:abstractNum w:abstractNumId="8" w15:restartNumberingAfterBreak="0">
     <w:nsid w:val="3F3E6D58"/>
     <w:multiLevelType w:val="hybridMultilevel"/>
     <w:tmpl w:val="7E6ED49E"/>
@@ -1622,7 +2898,96 @@
       </w:pPr>
     </w:lvl>
   </w:abstractNum>
-  <w:abstractNum w:abstractNumId="8" w15:restartNumberingAfterBreak="0">
+  <w:abstractNum w:abstractNumId="9" w15:restartNumberingAfterBreak="0">
+    <w:nsid w:val="412B41CA"/>
+    <w:multiLevelType w:val="hybridMultilevel"/>
+    <w:tmpl w:val="7E6ED49E"/>
+    <w:lvl w:ilvl="0" w:tplc="0C0A000F">
+      <w:start w:val="1"/>
+      <w:numFmt w:val="decimal"/>
+      <w:lvlText w:val="%1."/>
+      <w:lvlJc w:val="left"/>
+      <w:pPr>
+        <w:ind w:left="720" w:hanging="360"/>
+      </w:pPr>
+      <w:rPr>
+        <w:rFonts w:hint="default"/>
+      </w:rPr>
+    </w:lvl>
+    <w:lvl w:ilvl="1" w:tplc="0C0A0019" w:tentative="1">
+      <w:start w:val="1"/>
+      <w:numFmt w:val="lowerLetter"/>
+      <w:lvlText w:val="%2."/>
+      <w:lvlJc w:val="left"/>
+      <w:pPr>
+        <w:ind w:left="1440" w:hanging="360"/>
+      </w:pPr>
+    </w:lvl>
+    <w:lvl w:ilvl="2" w:tplc="0C0A001B" w:tentative="1">
+      <w:start w:val="1"/>
+      <w:numFmt w:val="lowerRoman"/>
+      <w:lvlText w:val="%3."/>
+      <w:lvlJc w:val="right"/>
+      <w:pPr>
+        <w:ind w:left="2160" w:hanging="180"/>
+      </w:pPr>
+    </w:lvl>
+    <w:lvl w:ilvl="3" w:tplc="0C0A000F" w:tentative="1">
+      <w:start w:val="1"/>
+      <w:numFmt w:val="decimal"/>
+      <w:lvlText w:val="%4."/>
+      <w:lvlJc w:val="left"/>
+      <w:pPr>
+        <w:ind w:left="2880" w:hanging="360"/>
+      </w:pPr>
+    </w:lvl>
+    <w:lvl w:ilvl="4" w:tplc="0C0A0019" w:tentative="1">
+      <w:start w:val="1"/>
+      <w:numFmt w:val="lowerLetter"/>
+      <w:lvlText w:val="%5."/>
+      <w:lvlJc w:val="left"/>
+      <w:pPr>
+        <w:ind w:left="3600" w:hanging="360"/>
+      </w:pPr>
+    </w:lvl>
+    <w:lvl w:ilvl="5" w:tplc="0C0A001B" w:tentative="1">
+      <w:start w:val="1"/>
+      <w:numFmt w:val="lowerRoman"/>
+      <w:lvlText w:val="%6."/>
+      <w:lvlJc w:val="right"/>
+      <w:pPr>
+        <w:ind w:left="4320" w:hanging="180"/>
+      </w:pPr>
+    </w:lvl>
+    <w:lvl w:ilvl="6" w:tplc="0C0A000F" w:tentative="1">
+      <w:start w:val="1"/>
+      <w:numFmt w:val="decimal"/>
+      <w:lvlText w:val="%7."/>
+      <w:lvlJc w:val="left"/>
+      <w:pPr>
+        <w:ind w:left="5040" w:hanging="360"/>
+      </w:pPr>
+    </w:lvl>
+    <w:lvl w:ilvl="7" w:tplc="0C0A0019" w:tentative="1">
+      <w:start w:val="1"/>
+      <w:numFmt w:val="lowerLetter"/>
+      <w:lvlText w:val="%8."/>
+      <w:lvlJc w:val="left"/>
+      <w:pPr>
+        <w:ind w:left="5760" w:hanging="360"/>
+      </w:pPr>
+    </w:lvl>
+    <w:lvl w:ilvl="8" w:tplc="0C0A001B" w:tentative="1">
+      <w:start w:val="1"/>
+      <w:numFmt w:val="lowerRoman"/>
+      <w:lvlText w:val="%9."/>
+      <w:lvlJc w:val="right"/>
+      <w:pPr>
+        <w:ind w:left="6480" w:hanging="180"/>
+      </w:pPr>
+    </w:lvl>
+  </w:abstractNum>
+  <w:abstractNum w:abstractNumId="10" w15:restartNumberingAfterBreak="0">
     <w:nsid w:val="52D048D8"/>
     <w:multiLevelType w:val="hybridMultilevel"/>
     <w:tmpl w:val="7E6ED49E"/>
@@ -1711,7 +3076,7 @@
       </w:pPr>
     </w:lvl>
   </w:abstractNum>
-  <w:abstractNum w:abstractNumId="9" w15:restartNumberingAfterBreak="0">
+  <w:abstractNum w:abstractNumId="11" w15:restartNumberingAfterBreak="0">
     <w:nsid w:val="5D787E05"/>
     <w:multiLevelType w:val="hybridMultilevel"/>
     <w:tmpl w:val="903CB62C"/>
@@ -1800,7 +3165,7 @@
       </w:pPr>
     </w:lvl>
   </w:abstractNum>
-  <w:abstractNum w:abstractNumId="10" w15:restartNumberingAfterBreak="0">
+  <w:abstractNum w:abstractNumId="12" w15:restartNumberingAfterBreak="0">
     <w:nsid w:val="7A4F009B"/>
     <w:multiLevelType w:val="hybridMultilevel"/>
     <w:tmpl w:val="7E6ED49E"/>
@@ -1893,34 +3258,40 @@
     <w:abstractNumId w:val="1"/>
   </w:num>
   <w:num w:numId="2">
+    <w:abstractNumId w:val="6"/>
+  </w:num>
+  <w:num w:numId="3">
     <w:abstractNumId w:val="5"/>
   </w:num>
-  <w:num w:numId="3">
+  <w:num w:numId="4">
     <w:abstractNumId w:val="4"/>
   </w:num>
-  <w:num w:numId="4">
-    <w:abstractNumId w:val="3"/>
-  </w:num>
   <w:num w:numId="5">
-    <w:abstractNumId w:val="10"/>
+    <w:abstractNumId w:val="12"/>
   </w:num>
   <w:num w:numId="6">
-    <w:abstractNumId w:val="7"/>
+    <w:abstractNumId w:val="8"/>
   </w:num>
   <w:num w:numId="7">
-    <w:abstractNumId w:val="8"/>
+    <w:abstractNumId w:val="10"/>
   </w:num>
   <w:num w:numId="8">
     <w:abstractNumId w:val="0"/>
   </w:num>
   <w:num w:numId="9">
-    <w:abstractNumId w:val="9"/>
+    <w:abstractNumId w:val="11"/>
   </w:num>
   <w:num w:numId="10">
     <w:abstractNumId w:val="2"/>
   </w:num>
   <w:num w:numId="11">
-    <w:abstractNumId w:val="6"/>
+    <w:abstractNumId w:val="7"/>
+  </w:num>
+  <w:num w:numId="12">
+    <w:abstractNumId w:val="9"/>
+  </w:num>
+  <w:num w:numId="13">
+    <w:abstractNumId w:val="3"/>
   </w:num>
 </w:numbering>
 </file>
@@ -2363,6 +3734,28 @@
       <w:szCs w:val="26"/>
     </w:rPr>
   </w:style>
+  <w:style w:type="paragraph" w:styleId="Ttulo3">
+    <w:name w:val="heading 3"/>
+    <w:basedOn w:val="Normal"/>
+    <w:next w:val="Normal"/>
+    <w:link w:val="Ttulo3Car"/>
+    <w:uiPriority w:val="9"/>
+    <w:unhideWhenUsed/>
+    <w:qFormat/>
+    <w:rsid w:val="00A66CE2"/>
+    <w:pPr>
+      <w:keepNext/>
+      <w:keepLines/>
+      <w:spacing w:before="40" w:after="0"/>
+      <w:outlineLvl w:val="2"/>
+    </w:pPr>
+    <w:rPr>
+      <w:rFonts w:asciiTheme="majorHAnsi" w:eastAsiaTheme="majorEastAsia" w:hAnsiTheme="majorHAnsi" w:cstheme="majorBidi"/>
+      <w:color w:val="6B3A03" w:themeColor="accent1" w:themeShade="7F"/>
+      <w:sz w:val="24"/>
+      <w:szCs w:val="24"/>
+    </w:rPr>
+  </w:style>
   <w:style w:type="paragraph" w:styleId="Ttulo4">
     <w:name w:val="heading 4"/>
     <w:basedOn w:val="Normal"/>
@@ -2574,6 +3967,32 @@
     <w:pPr>
       <w:spacing w:after="100"/>
       <w:ind w:left="220"/>
+    </w:pPr>
+  </w:style>
+  <w:style w:type="character" w:customStyle="1" w:styleId="Ttulo3Car">
+    <w:name w:val="Título 3 Car"/>
+    <w:basedOn w:val="Fuentedeprrafopredeter"/>
+    <w:link w:val="Ttulo3"/>
+    <w:uiPriority w:val="9"/>
+    <w:rsid w:val="00A66CE2"/>
+    <w:rPr>
+      <w:rFonts w:asciiTheme="majorHAnsi" w:eastAsiaTheme="majorEastAsia" w:hAnsiTheme="majorHAnsi" w:cstheme="majorBidi"/>
+      <w:color w:val="6B3A03" w:themeColor="accent1" w:themeShade="7F"/>
+      <w:sz w:val="24"/>
+      <w:szCs w:val="24"/>
+    </w:rPr>
+  </w:style>
+  <w:style w:type="paragraph" w:styleId="TDC3">
+    <w:name w:val="toc 3"/>
+    <w:basedOn w:val="Normal"/>
+    <w:next w:val="Normal"/>
+    <w:autoRedefine/>
+    <w:uiPriority w:val="39"/>
+    <w:unhideWhenUsed/>
+    <w:rsid w:val="00A66CE2"/>
+    <w:pPr>
+      <w:spacing w:after="100"/>
+      <w:ind w:left="440"/>
     </w:pPr>
   </w:style>
 </w:styles>
@@ -2845,7 +4264,7 @@
 </file>
 
 <file path=customXml/itemProps1.xml><?xml version="1.0" encoding="utf-8"?>
-<ds:datastoreItem xmlns:ds="http://schemas.openxmlformats.org/officeDocument/2006/customXml" ds:itemID="{8ABA111C-F197-41A6-8686-472C7F612E3A}">
+<ds:datastoreItem xmlns:ds="http://schemas.openxmlformats.org/officeDocument/2006/customXml" ds:itemID="{B9A12794-443B-4A97-809A-A4900394A578}">
   <ds:schemaRefs>
     <ds:schemaRef ds:uri="http://schemas.openxmlformats.org/officeDocument/2006/bibliography"/>
   </ds:schemaRefs>

</xml_diff>